<commit_message>
Khoi tao du an va giao dien tinh
</commit_message>
<xml_diff>
--- a/Báo cáo PBL4.docx
+++ b/Báo cáo PBL4.docx
@@ -1,6 +1,6 @@
 
 <file path=word/document.xml><?xml version="1.0" encoding="utf-8"?>
-<w:document xmlns:wpc="http://schemas.microsoft.com/office/word/2010/wordprocessingCanvas" xmlns:cx="http://schemas.microsoft.com/office/drawing/2014/chartex" xmlns:cx1="http://schemas.microsoft.com/office/drawing/2015/9/8/chartex" xmlns:cx2="http://schemas.microsoft.com/office/drawing/2015/10/21/chartex" xmlns:cx3="http://schemas.microsoft.com/office/drawing/2016/5/9/chartex" xmlns:cx4="http://schemas.microsoft.com/office/drawing/2016/5/10/chartex" xmlns:cx5="http://schemas.microsoft.com/office/drawing/2016/5/11/chartex" xmlns:cx6="http://schemas.microsoft.com/office/drawing/2016/5/12/chartex" xmlns:cx7="http://schemas.microsoft.com/office/drawing/2016/5/13/chartex" xmlns:cx8="http://schemas.microsoft.com/office/drawing/2016/5/14/chartex" xmlns:mc="http://schemas.openxmlformats.org/markup-compatibility/2006" xmlns:aink="http://schemas.microsoft.com/office/drawing/2016/ink" xmlns:am3d="http://schemas.microsoft.com/office/drawing/2017/model3d" xmlns:o="urn:schemas-microsoft-com:office:office" xmlns:oel="http://schemas.microsoft.com/office/2019/extlst" xmlns:r="http://schemas.openxmlformats.org/officeDocument/2006/relationships" xmlns:m="http://schemas.openxmlformats.org/officeDocument/2006/math" xmlns:v="urn:schemas-microsoft-com:vml" xmlns:wp14="http://schemas.microsoft.com/office/word/2010/wordprocessingDrawing" xmlns:wp="http://schemas.openxmlformats.org/drawingml/2006/wordprocessingDrawing" xmlns:w10="urn:schemas-microsoft-com:office:word" xmlns:w="http://schemas.openxmlformats.org/wordprocessingml/2006/main" xmlns:w14="http://schemas.microsoft.com/office/word/2010/wordml" xmlns:w15="http://schemas.microsoft.com/office/word/2012/wordml" xmlns:w16cei="http://schemas.microsoft.com/office/word/2026/wordml/cei" xmlns:w16cex="http://schemas.microsoft.com/office/word/2018/wordml/cex" xmlns:w16cid="http://schemas.microsoft.com/office/word/2016/wordml/cid" xmlns:w16="http://schemas.microsoft.com/office/word/2018/wordml" xmlns:w16du="http://schemas.microsoft.com/office/word/2023/wordml/word16du" xmlns:w16sdtdh="http://schemas.microsoft.com/office/word/2020/wordml/sdtdatahash" xmlns:w16sdtfl="http://schemas.microsoft.com/office/word/2024/wordml/sdtformatlock" xmlns:w16se="http://schemas.microsoft.com/office/word/2015/wordml/symex" xmlns:wpg="http://schemas.microsoft.com/office/word/2010/wordprocessingGroup" xmlns:wpi="http://schemas.microsoft.com/office/word/2010/wordprocessingInk" xmlns:wne="http://schemas.microsoft.com/office/word/2006/wordml" xmlns:wps="http://schemas.microsoft.com/office/word/2010/wordprocessingShape" mc:Ignorable="w14 w15 w16se w16cid w16 w16cex w16sdtdh w16sdtfl w16du wp14">
+<w:document xmlns:wpc="http://schemas.microsoft.com/office/word/2010/wordprocessingCanvas" xmlns:cx="http://schemas.microsoft.com/office/drawing/2014/chartex" xmlns:cx1="http://schemas.microsoft.com/office/drawing/2015/9/8/chartex" xmlns:cx2="http://schemas.microsoft.com/office/drawing/2015/10/21/chartex" xmlns:cx3="http://schemas.microsoft.com/office/drawing/2016/5/9/chartex" xmlns:cx4="http://schemas.microsoft.com/office/drawing/2016/5/10/chartex" xmlns:cx5="http://schemas.microsoft.com/office/drawing/2016/5/11/chartex" xmlns:cx6="http://schemas.microsoft.com/office/drawing/2016/5/12/chartex" xmlns:cx7="http://schemas.microsoft.com/office/drawing/2016/5/13/chartex" xmlns:cx8="http://schemas.microsoft.com/office/drawing/2016/5/14/chartex" xmlns:mc="http://schemas.openxmlformats.org/markup-compatibility/2006" xmlns:aink="http://schemas.microsoft.com/office/drawing/2016/ink" xmlns:am3d="http://schemas.microsoft.com/office/drawing/2017/model3d" xmlns:o="urn:schemas-microsoft-com:office:office" xmlns:oel="http://schemas.microsoft.com/office/2019/extlst" xmlns:r="http://schemas.openxmlformats.org/officeDocument/2006/relationships" xmlns:m="http://schemas.openxmlformats.org/officeDocument/2006/math" xmlns:v="urn:schemas-microsoft-com:vml" xmlns:wp14="http://schemas.microsoft.com/office/word/2010/wordprocessingDrawing" xmlns:wp="http://schemas.openxmlformats.org/drawingml/2006/wordprocessingDrawing" xmlns:w10="urn:schemas-microsoft-com:office:word" xmlns:w="http://schemas.openxmlformats.org/wordprocessingml/2006/main" xmlns:w14="http://schemas.microsoft.com/office/word/2010/wordml" xmlns:w15="http://schemas.microsoft.com/office/word/2012/wordml" xmlns:w16cex="http://schemas.microsoft.com/office/word/2018/wordml/cex" xmlns:w16cid="http://schemas.microsoft.com/office/word/2016/wordml/cid" xmlns:w16="http://schemas.microsoft.com/office/word/2018/wordml" xmlns:w16du="http://schemas.microsoft.com/office/word/2023/wordml/word16du" xmlns:w16sdtdh="http://schemas.microsoft.com/office/word/2020/wordml/sdtdatahash" xmlns:w16sdtfl="http://schemas.microsoft.com/office/word/2024/wordml/sdtformatlock" xmlns:w16se="http://schemas.microsoft.com/office/word/2015/wordml/symex" xmlns:wpg="http://schemas.microsoft.com/office/word/2010/wordprocessingGroup" xmlns:wpi="http://schemas.microsoft.com/office/word/2010/wordprocessingInk" xmlns:wne="http://schemas.microsoft.com/office/word/2006/wordml" xmlns:wps="http://schemas.microsoft.com/office/word/2010/wordprocessingShape" mc:Ignorable="w14 w15 w16se w16cid w16 w16cex w16sdtdh w16sdtfl w16du wp14">
   <w:body>
     <w:p>
       <w:pPr>
@@ -76,12 +76,12 @@
         <w:pStyle w:val="Title"/>
         <w:outlineLvl w:val="9"/>
       </w:pPr>
-      <w:bookmarkStart w:id="0" w:name="_Toc493750743"/>
-      <w:bookmarkStart w:id="1" w:name="_Toc493750862"/>
-      <w:bookmarkStart w:id="2" w:name="_Toc504624775"/>
+      <w:bookmarkStart w:id="0" w:name="_Toc504624775"/>
+      <w:bookmarkStart w:id="1" w:name="_Toc493750743"/>
+      <w:bookmarkStart w:id="2" w:name="_Toc200307083"/>
       <w:bookmarkStart w:id="3" w:name="_Toc90369522"/>
       <w:bookmarkStart w:id="4" w:name="_Toc200307227"/>
-      <w:bookmarkStart w:id="5" w:name="_Toc200307083"/>
+      <w:bookmarkStart w:id="5" w:name="_Toc493750862"/>
       <w:r>
         <w:rPr>
           <w:noProof/>
@@ -98,7 +98,13 @@
             <wp:extent cx="685800" cy="685800"/>
             <wp:effectExtent l="0" t="0" r="0" b="0"/>
             <wp:wrapNone/>
-            <wp:docPr id="2" name="Picture 2"/>
+            <wp:docPr id="2" name="Picture 2">
+              <a:extLst xmlns:a="http://schemas.openxmlformats.org/drawingml/2006/main">
+                <a:ext uri="{FF2B5EF4-FFF2-40B4-BE49-F238E27FC236}">
+                  <a16:creationId xmlns:a16="http://schemas.microsoft.com/office/drawing/2014/main" id="{DFBA2724-1D3D-4618-BAB2-89F606700096}"/>
+                </a:ext>
+              </a:extLst>
+            </wp:docPr>
             <wp:cNvGraphicFramePr>
               <a:graphicFrameLocks xmlns:a="http://schemas.openxmlformats.org/drawingml/2006/main" noChangeAspect="1"/>
             </wp:cNvGraphicFramePr>
@@ -112,7 +118,7 @@
                     </pic:cNvPicPr>
                   </pic:nvPicPr>
                   <pic:blipFill>
-                    <a:blip r:embed="rId11">
+                    <a:blip r:embed="rId10">
                       <a:extLst>
                         <a:ext uri="{28A0092B-C50C-407E-A947-70E740481C1C}">
                           <a14:useLocalDpi xmlns:a14="http://schemas.microsoft.com/office/drawing/2010/main" val="0"/>
@@ -543,12 +549,12 @@
           <w:lang w:val="vi-VN"/>
         </w:rPr>
         <w:sectPr>
-          <w:headerReference w:type="even" r:id="rId12"/>
-          <w:headerReference w:type="default" r:id="rId13"/>
-          <w:footerReference w:type="even" r:id="rId14"/>
-          <w:footerReference w:type="default" r:id="rId15"/>
-          <w:headerReference w:type="first" r:id="rId16"/>
-          <w:footerReference w:type="first" r:id="rId17"/>
+          <w:headerReference w:type="even" r:id="rId11"/>
+          <w:headerReference w:type="default" r:id="rId12"/>
+          <w:footerReference w:type="even" r:id="rId13"/>
+          <w:footerReference w:type="default" r:id="rId14"/>
+          <w:headerReference w:type="first" r:id="rId15"/>
+          <w:footerReference w:type="first" r:id="rId16"/>
           <w:type w:val="continuous"/>
           <w:pgSz w:w="11909" w:h="16834" w:code="9"/>
           <w:pgMar w:top="1134" w:right="1134" w:bottom="1134" w:left="1701" w:header="720" w:footer="720" w:gutter="0"/>
@@ -567,10 +573,9 @@
       <w:pPr>
         <w:pStyle w:val="Title"/>
       </w:pPr>
-      <w:bookmarkStart w:id="6" w:name="_Toc200307228"/>
-      <w:bookmarkStart w:id="7" w:name="_Toc200307084"/>
-      <w:r>
-        <w:lastRenderedPageBreak/>
+      <w:bookmarkStart w:id="6" w:name="_Toc200307084"/>
+      <w:bookmarkStart w:id="7" w:name="_Toc200307228"/>
+      <w:r>
         <w:t>MỤC LỤC</w:t>
       </w:r>
       <w:bookmarkEnd w:id="6"/>
@@ -1797,10 +1802,9 @@
       <w:r>
         <w:br w:type="page"/>
       </w:r>
-      <w:bookmarkStart w:id="8" w:name="_Toc200307229"/>
-      <w:bookmarkStart w:id="9" w:name="_Toc200307085"/>
-      <w:r>
-        <w:lastRenderedPageBreak/>
+      <w:bookmarkStart w:id="8" w:name="_Toc200307085"/>
+      <w:bookmarkStart w:id="9" w:name="_Toc200307229"/>
+      <w:r>
         <w:t xml:space="preserve">DANH </w:t>
       </w:r>
       <w:r>
@@ -2033,7 +2037,6 @@
       <w:bookmarkStart w:id="11" w:name="_Toc200307230"/>
       <w:bookmarkStart w:id="12" w:name="_Toc200307086"/>
       <w:r>
-        <w:lastRenderedPageBreak/>
         <w:t xml:space="preserve">DANH </w:t>
       </w:r>
       <w:r>
@@ -2081,10 +2084,9 @@
       <w:pPr>
         <w:pStyle w:val="Title"/>
       </w:pPr>
-      <w:bookmarkStart w:id="13" w:name="_Toc200307231"/>
-      <w:bookmarkStart w:id="14" w:name="_Toc200307087"/>
-      <w:r>
-        <w:lastRenderedPageBreak/>
+      <w:bookmarkStart w:id="13" w:name="_Toc200307087"/>
+      <w:bookmarkStart w:id="14" w:name="_Toc200307231"/>
+      <w:r>
         <w:t>DANH SÁCH CÁC TỪ VIẾT TẮT</w:t>
       </w:r>
       <w:bookmarkEnd w:id="13"/>
@@ -2135,7 +2137,6 @@
       <w:bookmarkStart w:id="15" w:name="_Toc200307232"/>
       <w:bookmarkStart w:id="16" w:name="_Toc200307088"/>
       <w:r>
-        <w:lastRenderedPageBreak/>
         <w:t>MỞ ĐẦU (GIỚI THIỆU ĐỀ TÀI)</w:t>
       </w:r>
       <w:bookmarkEnd w:id="15"/>
@@ -2306,7 +2307,6 @@
         <w:rPr>
           <w:rStyle w:val="apple-converted-space"/>
         </w:rPr>
-        <w:lastRenderedPageBreak/>
         <w:t xml:space="preserve">CHƯƠNG 1. </w:t>
       </w:r>
       <w:r>
@@ -2448,7 +2448,6 @@
         <w:rPr>
           <w:lang w:val="vi-VN"/>
         </w:rPr>
-        <w:lastRenderedPageBreak/>
         <w:tab/>
       </w:r>
     </w:p>
@@ -2480,7 +2479,7 @@
         <w:keepNext/>
         <w:numPr>
           <w:ilvl w:val="0"/>
-          <w:numId w:val="3"/>
+          <w:numId w:val="14"/>
         </w:numPr>
         <w:spacing w:before="240" w:after="60"/>
         <w:outlineLvl w:val="0"/>
@@ -2559,8 +2558,8 @@
           <w:numId w:val="0"/>
         </w:numPr>
       </w:pPr>
-      <w:bookmarkStart w:id="35" w:name="_Toc200307238"/>
-      <w:bookmarkStart w:id="36" w:name="_Toc200307098"/>
+      <w:bookmarkStart w:id="35" w:name="_Toc200307098"/>
+      <w:bookmarkStart w:id="36" w:name="_Toc200307238"/>
       <w:r>
         <w:t>KẾT LUẬN VÀ HƯỚNG PHÁT TRIỂN</w:t>
       </w:r>
@@ -2572,7 +2571,7 @@
         <w:pStyle w:val="ListParagraph"/>
         <w:numPr>
           <w:ilvl w:val="0"/>
-          <w:numId w:val="6"/>
+          <w:numId w:val="15"/>
         </w:numPr>
       </w:pPr>
       <w:r>
@@ -2593,7 +2592,7 @@
         <w:pStyle w:val="ListParagraph"/>
         <w:numPr>
           <w:ilvl w:val="0"/>
-          <w:numId w:val="6"/>
+          <w:numId w:val="15"/>
         </w:numPr>
       </w:pPr>
       <w:r>
@@ -2623,10 +2622,9 @@
       <w:r>
         <w:br w:type="page"/>
       </w:r>
-      <w:bookmarkStart w:id="37" w:name="_Toc200307239"/>
-      <w:bookmarkStart w:id="38" w:name="_Toc200307099"/>
-      <w:r>
-        <w:lastRenderedPageBreak/>
+      <w:bookmarkStart w:id="37" w:name="_Toc200307099"/>
+      <w:bookmarkStart w:id="38" w:name="_Toc200307239"/>
+      <w:r>
         <w:t>TÀI LIỆU THAM KHẢO</w:t>
       </w:r>
       <w:bookmarkEnd w:id="37"/>
@@ -2645,8 +2643,8 @@
           <w:lang w:val="vi-VN"/>
         </w:rPr>
       </w:pPr>
-      <w:bookmarkStart w:id="39" w:name="_Toc200307240"/>
-      <w:bookmarkStart w:id="40" w:name="_Toc200307100"/>
+      <w:bookmarkStart w:id="39" w:name="_Toc200307100"/>
+      <w:bookmarkStart w:id="40" w:name="_Toc200307240"/>
       <w:r>
         <w:rPr>
           <w:lang w:val="vi-VN"/>
@@ -2685,8 +2683,8 @@
           <w:lang w:val="vi-VN"/>
         </w:rPr>
       </w:pPr>
-      <w:bookmarkStart w:id="41" w:name="_Toc200307241"/>
-      <w:bookmarkStart w:id="42" w:name="_Toc200307101"/>
+      <w:bookmarkStart w:id="41" w:name="_Toc200307101"/>
+      <w:bookmarkStart w:id="42" w:name="_Toc200307241"/>
       <w:r>
         <w:rPr>
           <w:lang w:val="vi-VN"/>
@@ -2995,8 +2993,8 @@
       <w:pPr>
         <w:pStyle w:val="Title"/>
       </w:pPr>
-      <w:bookmarkStart w:id="43" w:name="_Toc200307242"/>
-      <w:bookmarkStart w:id="44" w:name="_Toc200307102"/>
+      <w:bookmarkStart w:id="43" w:name="_Toc200307102"/>
+      <w:bookmarkStart w:id="44" w:name="_Toc200307242"/>
       <w:r>
         <w:t>PHỤ LỤC</w:t>
       </w:r>
@@ -3004,8 +3002,8 @@
       <w:bookmarkEnd w:id="44"/>
     </w:p>
     <w:sectPr>
-      <w:headerReference w:type="default" r:id="rId18"/>
-      <w:footerReference w:type="default" r:id="rId19"/>
+      <w:headerReference w:type="default" r:id="rId17"/>
+      <w:footerReference w:type="default" r:id="rId18"/>
       <w:pgSz w:w="11909" w:h="16834" w:code="9"/>
       <w:pgMar w:top="1138" w:right="1138" w:bottom="1138" w:left="1699" w:header="720" w:footer="432" w:gutter="0"/>
       <w:cols w:space="720"/>
@@ -3016,7 +3014,7 @@
 </file>
 
 <file path=word/endnotes.xml><?xml version="1.0" encoding="utf-8"?>
-<w:endnotes xmlns:wpc="http://schemas.microsoft.com/office/word/2010/wordprocessingCanvas" xmlns:cx="http://schemas.microsoft.com/office/drawing/2014/chartex" xmlns:cx1="http://schemas.microsoft.com/office/drawing/2015/9/8/chartex" xmlns:cx2="http://schemas.microsoft.com/office/drawing/2015/10/21/chartex" xmlns:cx3="http://schemas.microsoft.com/office/drawing/2016/5/9/chartex" xmlns:cx4="http://schemas.microsoft.com/office/drawing/2016/5/10/chartex" xmlns:cx5="http://schemas.microsoft.com/office/drawing/2016/5/11/chartex" xmlns:cx6="http://schemas.microsoft.com/office/drawing/2016/5/12/chartex" xmlns:cx7="http://schemas.microsoft.com/office/drawing/2016/5/13/chartex" xmlns:cx8="http://schemas.microsoft.com/office/drawing/2016/5/14/chartex" xmlns:mc="http://schemas.openxmlformats.org/markup-compatibility/2006" xmlns:aink="http://schemas.microsoft.com/office/drawing/2016/ink" xmlns:am3d="http://schemas.microsoft.com/office/drawing/2017/model3d" xmlns:o="urn:schemas-microsoft-com:office:office" xmlns:oel="http://schemas.microsoft.com/office/2019/extlst" xmlns:r="http://schemas.openxmlformats.org/officeDocument/2006/relationships" xmlns:m="http://schemas.openxmlformats.org/officeDocument/2006/math" xmlns:v="urn:schemas-microsoft-com:vml" xmlns:wp14="http://schemas.microsoft.com/office/word/2010/wordprocessingDrawing" xmlns:wp="http://schemas.openxmlformats.org/drawingml/2006/wordprocessingDrawing" xmlns:w10="urn:schemas-microsoft-com:office:word" xmlns:w="http://schemas.openxmlformats.org/wordprocessingml/2006/main" xmlns:w14="http://schemas.microsoft.com/office/word/2010/wordml" xmlns:w15="http://schemas.microsoft.com/office/word/2012/wordml" xmlns:w16cei="http://schemas.microsoft.com/office/word/2026/wordml/cei" xmlns:w16cex="http://schemas.microsoft.com/office/word/2018/wordml/cex" xmlns:w16cid="http://schemas.microsoft.com/office/word/2016/wordml/cid" xmlns:w16="http://schemas.microsoft.com/office/word/2018/wordml" xmlns:w16du="http://schemas.microsoft.com/office/word/2023/wordml/word16du" xmlns:w16sdtdh="http://schemas.microsoft.com/office/word/2020/wordml/sdtdatahash" xmlns:w16sdtfl="http://schemas.microsoft.com/office/word/2024/wordml/sdtformatlock" xmlns:w16se="http://schemas.microsoft.com/office/word/2015/wordml/symex" xmlns:wpg="http://schemas.microsoft.com/office/word/2010/wordprocessingGroup" xmlns:wpi="http://schemas.microsoft.com/office/word/2010/wordprocessingInk" xmlns:wne="http://schemas.microsoft.com/office/word/2006/wordml" xmlns:wps="http://schemas.microsoft.com/office/word/2010/wordprocessingShape" mc:Ignorable="w14 w15 w16se w16cid w16 w16cex w16sdtdh w16sdtfl w16du wp14">
+<w:endnotes xmlns:wpc="http://schemas.microsoft.com/office/word/2010/wordprocessingCanvas" xmlns:cx="http://schemas.microsoft.com/office/drawing/2014/chartex" xmlns:cx1="http://schemas.microsoft.com/office/drawing/2015/9/8/chartex" xmlns:cx2="http://schemas.microsoft.com/office/drawing/2015/10/21/chartex" xmlns:cx3="http://schemas.microsoft.com/office/drawing/2016/5/9/chartex" xmlns:cx4="http://schemas.microsoft.com/office/drawing/2016/5/10/chartex" xmlns:cx5="http://schemas.microsoft.com/office/drawing/2016/5/11/chartex" xmlns:cx6="http://schemas.microsoft.com/office/drawing/2016/5/12/chartex" xmlns:cx7="http://schemas.microsoft.com/office/drawing/2016/5/13/chartex" xmlns:cx8="http://schemas.microsoft.com/office/drawing/2016/5/14/chartex" xmlns:mc="http://schemas.openxmlformats.org/markup-compatibility/2006" xmlns:aink="http://schemas.microsoft.com/office/drawing/2016/ink" xmlns:am3d="http://schemas.microsoft.com/office/drawing/2017/model3d" xmlns:o="urn:schemas-microsoft-com:office:office" xmlns:oel="http://schemas.microsoft.com/office/2019/extlst" xmlns:r="http://schemas.openxmlformats.org/officeDocument/2006/relationships" xmlns:m="http://schemas.openxmlformats.org/officeDocument/2006/math" xmlns:v="urn:schemas-microsoft-com:vml" xmlns:wp14="http://schemas.microsoft.com/office/word/2010/wordprocessingDrawing" xmlns:wp="http://schemas.openxmlformats.org/drawingml/2006/wordprocessingDrawing" xmlns:w10="urn:schemas-microsoft-com:office:word" xmlns:w="http://schemas.openxmlformats.org/wordprocessingml/2006/main" xmlns:w14="http://schemas.microsoft.com/office/word/2010/wordml" xmlns:w15="http://schemas.microsoft.com/office/word/2012/wordml" xmlns:w16cex="http://schemas.microsoft.com/office/word/2018/wordml/cex" xmlns:w16cid="http://schemas.microsoft.com/office/word/2016/wordml/cid" xmlns:w16="http://schemas.microsoft.com/office/word/2018/wordml" xmlns:w16du="http://schemas.microsoft.com/office/word/2023/wordml/word16du" xmlns:w16sdtdh="http://schemas.microsoft.com/office/word/2020/wordml/sdtdatahash" xmlns:w16sdtfl="http://schemas.microsoft.com/office/word/2024/wordml/sdtformatlock" xmlns:w16se="http://schemas.microsoft.com/office/word/2015/wordml/symex" xmlns:wpg="http://schemas.microsoft.com/office/word/2010/wordprocessingGroup" xmlns:wpi="http://schemas.microsoft.com/office/word/2010/wordprocessingInk" xmlns:wne="http://schemas.microsoft.com/office/word/2006/wordml" xmlns:wps="http://schemas.microsoft.com/office/word/2010/wordprocessingShape" mc:Ignorable="w14 w15 w16se w16cid w16 w16cex w16sdtdh w16sdtfl w16du wp14">
   <w:endnote w:type="separator" w:id="-1">
     <w:p>
       <w:r>
@@ -3035,7 +3033,7 @@
 </file>
 
 <file path=word/footer1.xml><?xml version="1.0" encoding="utf-8"?>
-<w:ftr xmlns:wpc="http://schemas.microsoft.com/office/word/2010/wordprocessingCanvas" xmlns:cx="http://schemas.microsoft.com/office/drawing/2014/chartex" xmlns:cx1="http://schemas.microsoft.com/office/drawing/2015/9/8/chartex" xmlns:cx2="http://schemas.microsoft.com/office/drawing/2015/10/21/chartex" xmlns:cx3="http://schemas.microsoft.com/office/drawing/2016/5/9/chartex" xmlns:cx4="http://schemas.microsoft.com/office/drawing/2016/5/10/chartex" xmlns:cx5="http://schemas.microsoft.com/office/drawing/2016/5/11/chartex" xmlns:cx6="http://schemas.microsoft.com/office/drawing/2016/5/12/chartex" xmlns:cx7="http://schemas.microsoft.com/office/drawing/2016/5/13/chartex" xmlns:cx8="http://schemas.microsoft.com/office/drawing/2016/5/14/chartex" xmlns:mc="http://schemas.openxmlformats.org/markup-compatibility/2006" xmlns:aink="http://schemas.microsoft.com/office/drawing/2016/ink" xmlns:am3d="http://schemas.microsoft.com/office/drawing/2017/model3d" xmlns:o="urn:schemas-microsoft-com:office:office" xmlns:oel="http://schemas.microsoft.com/office/2019/extlst" xmlns:r="http://schemas.openxmlformats.org/officeDocument/2006/relationships" xmlns:m="http://schemas.openxmlformats.org/officeDocument/2006/math" xmlns:v="urn:schemas-microsoft-com:vml" xmlns:wp14="http://schemas.microsoft.com/office/word/2010/wordprocessingDrawing" xmlns:wp="http://schemas.openxmlformats.org/drawingml/2006/wordprocessingDrawing" xmlns:w10="urn:schemas-microsoft-com:office:word" xmlns:w="http://schemas.openxmlformats.org/wordprocessingml/2006/main" xmlns:w14="http://schemas.microsoft.com/office/word/2010/wordml" xmlns:w15="http://schemas.microsoft.com/office/word/2012/wordml" xmlns:w16cei="http://schemas.microsoft.com/office/word/2026/wordml/cei" xmlns:w16cex="http://schemas.microsoft.com/office/word/2018/wordml/cex" xmlns:w16cid="http://schemas.microsoft.com/office/word/2016/wordml/cid" xmlns:w16="http://schemas.microsoft.com/office/word/2018/wordml" xmlns:w16du="http://schemas.microsoft.com/office/word/2023/wordml/word16du" xmlns:w16sdtdh="http://schemas.microsoft.com/office/word/2020/wordml/sdtdatahash" xmlns:w16sdtfl="http://schemas.microsoft.com/office/word/2024/wordml/sdtformatlock" xmlns:w16se="http://schemas.microsoft.com/office/word/2015/wordml/symex" xmlns:wpg="http://schemas.microsoft.com/office/word/2010/wordprocessingGroup" xmlns:wpi="http://schemas.microsoft.com/office/word/2010/wordprocessingInk" xmlns:wne="http://schemas.microsoft.com/office/word/2006/wordml" xmlns:wps="http://schemas.microsoft.com/office/word/2010/wordprocessingShape" mc:Ignorable="w14 w15 w16se w16cid w16 w16cex w16sdtdh w16sdtfl w16du wp14">
+<w:ftr xmlns:wpc="http://schemas.microsoft.com/office/word/2010/wordprocessingCanvas" xmlns:cx="http://schemas.microsoft.com/office/drawing/2014/chartex" xmlns:cx1="http://schemas.microsoft.com/office/drawing/2015/9/8/chartex" xmlns:cx2="http://schemas.microsoft.com/office/drawing/2015/10/21/chartex" xmlns:cx3="http://schemas.microsoft.com/office/drawing/2016/5/9/chartex" xmlns:cx4="http://schemas.microsoft.com/office/drawing/2016/5/10/chartex" xmlns:cx5="http://schemas.microsoft.com/office/drawing/2016/5/11/chartex" xmlns:cx6="http://schemas.microsoft.com/office/drawing/2016/5/12/chartex" xmlns:cx7="http://schemas.microsoft.com/office/drawing/2016/5/13/chartex" xmlns:cx8="http://schemas.microsoft.com/office/drawing/2016/5/14/chartex" xmlns:mc="http://schemas.openxmlformats.org/markup-compatibility/2006" xmlns:aink="http://schemas.microsoft.com/office/drawing/2016/ink" xmlns:am3d="http://schemas.microsoft.com/office/drawing/2017/model3d" xmlns:o="urn:schemas-microsoft-com:office:office" xmlns:oel="http://schemas.microsoft.com/office/2019/extlst" xmlns:r="http://schemas.openxmlformats.org/officeDocument/2006/relationships" xmlns:m="http://schemas.openxmlformats.org/officeDocument/2006/math" xmlns:v="urn:schemas-microsoft-com:vml" xmlns:wp14="http://schemas.microsoft.com/office/word/2010/wordprocessingDrawing" xmlns:wp="http://schemas.openxmlformats.org/drawingml/2006/wordprocessingDrawing" xmlns:w10="urn:schemas-microsoft-com:office:word" xmlns:w="http://schemas.openxmlformats.org/wordprocessingml/2006/main" xmlns:w14="http://schemas.microsoft.com/office/word/2010/wordml" xmlns:w15="http://schemas.microsoft.com/office/word/2012/wordml" xmlns:w16cex="http://schemas.microsoft.com/office/word/2018/wordml/cex" xmlns:w16cid="http://schemas.microsoft.com/office/word/2016/wordml/cid" xmlns:w16="http://schemas.microsoft.com/office/word/2018/wordml" xmlns:w16du="http://schemas.microsoft.com/office/word/2023/wordml/word16du" xmlns:w16sdtdh="http://schemas.microsoft.com/office/word/2020/wordml/sdtdatahash" xmlns:w16sdtfl="http://schemas.microsoft.com/office/word/2024/wordml/sdtformatlock" xmlns:w16se="http://schemas.microsoft.com/office/word/2015/wordml/symex" xmlns:wpg="http://schemas.microsoft.com/office/word/2010/wordprocessingGroup" xmlns:wpi="http://schemas.microsoft.com/office/word/2010/wordprocessingInk" xmlns:wne="http://schemas.microsoft.com/office/word/2006/wordml" xmlns:wps="http://schemas.microsoft.com/office/word/2010/wordprocessingShape" mc:Ignorable="w14 w15 w16se w16cid w16 w16cex w16sdtdh w16sdtfl w16du wp14">
   <w:p>
     <w:pPr>
       <w:pStyle w:val="Footer"/>
@@ -3045,7 +3043,7 @@
 </file>
 
 <file path=word/footer2.xml><?xml version="1.0" encoding="utf-8"?>
-<w:ftr xmlns:wpc="http://schemas.microsoft.com/office/word/2010/wordprocessingCanvas" xmlns:cx="http://schemas.microsoft.com/office/drawing/2014/chartex" xmlns:cx1="http://schemas.microsoft.com/office/drawing/2015/9/8/chartex" xmlns:cx2="http://schemas.microsoft.com/office/drawing/2015/10/21/chartex" xmlns:cx3="http://schemas.microsoft.com/office/drawing/2016/5/9/chartex" xmlns:cx4="http://schemas.microsoft.com/office/drawing/2016/5/10/chartex" xmlns:cx5="http://schemas.microsoft.com/office/drawing/2016/5/11/chartex" xmlns:cx6="http://schemas.microsoft.com/office/drawing/2016/5/12/chartex" xmlns:cx7="http://schemas.microsoft.com/office/drawing/2016/5/13/chartex" xmlns:cx8="http://schemas.microsoft.com/office/drawing/2016/5/14/chartex" xmlns:mc="http://schemas.openxmlformats.org/markup-compatibility/2006" xmlns:aink="http://schemas.microsoft.com/office/drawing/2016/ink" xmlns:am3d="http://schemas.microsoft.com/office/drawing/2017/model3d" xmlns:o="urn:schemas-microsoft-com:office:office" xmlns:oel="http://schemas.microsoft.com/office/2019/extlst" xmlns:r="http://schemas.openxmlformats.org/officeDocument/2006/relationships" xmlns:m="http://schemas.openxmlformats.org/officeDocument/2006/math" xmlns:v="urn:schemas-microsoft-com:vml" xmlns:wp14="http://schemas.microsoft.com/office/word/2010/wordprocessingDrawing" xmlns:wp="http://schemas.openxmlformats.org/drawingml/2006/wordprocessingDrawing" xmlns:w10="urn:schemas-microsoft-com:office:word" xmlns:w="http://schemas.openxmlformats.org/wordprocessingml/2006/main" xmlns:w14="http://schemas.microsoft.com/office/word/2010/wordml" xmlns:w15="http://schemas.microsoft.com/office/word/2012/wordml" xmlns:w16cei="http://schemas.microsoft.com/office/word/2026/wordml/cei" xmlns:w16cex="http://schemas.microsoft.com/office/word/2018/wordml/cex" xmlns:w16cid="http://schemas.microsoft.com/office/word/2016/wordml/cid" xmlns:w16="http://schemas.microsoft.com/office/word/2018/wordml" xmlns:w16du="http://schemas.microsoft.com/office/word/2023/wordml/word16du" xmlns:w16sdtdh="http://schemas.microsoft.com/office/word/2020/wordml/sdtdatahash" xmlns:w16sdtfl="http://schemas.microsoft.com/office/word/2024/wordml/sdtformatlock" xmlns:w16se="http://schemas.microsoft.com/office/word/2015/wordml/symex" xmlns:wpg="http://schemas.microsoft.com/office/word/2010/wordprocessingGroup" xmlns:wpi="http://schemas.microsoft.com/office/word/2010/wordprocessingInk" xmlns:wne="http://schemas.microsoft.com/office/word/2006/wordml" xmlns:wps="http://schemas.microsoft.com/office/word/2010/wordprocessingShape" mc:Ignorable="w14 w15 w16se w16cid w16 w16cex w16sdtdh w16sdtfl w16du wp14">
+<w:ftr xmlns:wpc="http://schemas.microsoft.com/office/word/2010/wordprocessingCanvas" xmlns:cx="http://schemas.microsoft.com/office/drawing/2014/chartex" xmlns:cx1="http://schemas.microsoft.com/office/drawing/2015/9/8/chartex" xmlns:cx2="http://schemas.microsoft.com/office/drawing/2015/10/21/chartex" xmlns:cx3="http://schemas.microsoft.com/office/drawing/2016/5/9/chartex" xmlns:cx4="http://schemas.microsoft.com/office/drawing/2016/5/10/chartex" xmlns:cx5="http://schemas.microsoft.com/office/drawing/2016/5/11/chartex" xmlns:cx6="http://schemas.microsoft.com/office/drawing/2016/5/12/chartex" xmlns:cx7="http://schemas.microsoft.com/office/drawing/2016/5/13/chartex" xmlns:cx8="http://schemas.microsoft.com/office/drawing/2016/5/14/chartex" xmlns:mc="http://schemas.openxmlformats.org/markup-compatibility/2006" xmlns:aink="http://schemas.microsoft.com/office/drawing/2016/ink" xmlns:am3d="http://schemas.microsoft.com/office/drawing/2017/model3d" xmlns:o="urn:schemas-microsoft-com:office:office" xmlns:oel="http://schemas.microsoft.com/office/2019/extlst" xmlns:r="http://schemas.openxmlformats.org/officeDocument/2006/relationships" xmlns:m="http://schemas.openxmlformats.org/officeDocument/2006/math" xmlns:v="urn:schemas-microsoft-com:vml" xmlns:wp14="http://schemas.microsoft.com/office/word/2010/wordprocessingDrawing" xmlns:wp="http://schemas.openxmlformats.org/drawingml/2006/wordprocessingDrawing" xmlns:w10="urn:schemas-microsoft-com:office:word" xmlns:w="http://schemas.openxmlformats.org/wordprocessingml/2006/main" xmlns:w14="http://schemas.microsoft.com/office/word/2010/wordml" xmlns:w15="http://schemas.microsoft.com/office/word/2012/wordml" xmlns:w16cex="http://schemas.microsoft.com/office/word/2018/wordml/cex" xmlns:w16cid="http://schemas.microsoft.com/office/word/2016/wordml/cid" xmlns:w16="http://schemas.microsoft.com/office/word/2018/wordml" xmlns:w16du="http://schemas.microsoft.com/office/word/2023/wordml/word16du" xmlns:w16sdtdh="http://schemas.microsoft.com/office/word/2020/wordml/sdtdatahash" xmlns:w16sdtfl="http://schemas.microsoft.com/office/word/2024/wordml/sdtformatlock" xmlns:w16se="http://schemas.microsoft.com/office/word/2015/wordml/symex" xmlns:wpg="http://schemas.microsoft.com/office/word/2010/wordprocessingGroup" xmlns:wpi="http://schemas.microsoft.com/office/word/2010/wordprocessingInk" xmlns:wne="http://schemas.microsoft.com/office/word/2006/wordml" xmlns:wps="http://schemas.microsoft.com/office/word/2010/wordprocessingShape" mc:Ignorable="w14 w15 w16se w16cid w16 w16cex w16sdtdh w16sdtfl w16du wp14">
   <w:p>
     <w:pPr>
       <w:pStyle w:val="Footer"/>
@@ -3055,7 +3053,7 @@
 </file>
 
 <file path=word/footer3.xml><?xml version="1.0" encoding="utf-8"?>
-<w:ftr xmlns:wpc="http://schemas.microsoft.com/office/word/2010/wordprocessingCanvas" xmlns:cx="http://schemas.microsoft.com/office/drawing/2014/chartex" xmlns:cx1="http://schemas.microsoft.com/office/drawing/2015/9/8/chartex" xmlns:cx2="http://schemas.microsoft.com/office/drawing/2015/10/21/chartex" xmlns:cx3="http://schemas.microsoft.com/office/drawing/2016/5/9/chartex" xmlns:cx4="http://schemas.microsoft.com/office/drawing/2016/5/10/chartex" xmlns:cx5="http://schemas.microsoft.com/office/drawing/2016/5/11/chartex" xmlns:cx6="http://schemas.microsoft.com/office/drawing/2016/5/12/chartex" xmlns:cx7="http://schemas.microsoft.com/office/drawing/2016/5/13/chartex" xmlns:cx8="http://schemas.microsoft.com/office/drawing/2016/5/14/chartex" xmlns:mc="http://schemas.openxmlformats.org/markup-compatibility/2006" xmlns:aink="http://schemas.microsoft.com/office/drawing/2016/ink" xmlns:am3d="http://schemas.microsoft.com/office/drawing/2017/model3d" xmlns:o="urn:schemas-microsoft-com:office:office" xmlns:oel="http://schemas.microsoft.com/office/2019/extlst" xmlns:r="http://schemas.openxmlformats.org/officeDocument/2006/relationships" xmlns:m="http://schemas.openxmlformats.org/officeDocument/2006/math" xmlns:v="urn:schemas-microsoft-com:vml" xmlns:wp14="http://schemas.microsoft.com/office/word/2010/wordprocessingDrawing" xmlns:wp="http://schemas.openxmlformats.org/drawingml/2006/wordprocessingDrawing" xmlns:w10="urn:schemas-microsoft-com:office:word" xmlns:w="http://schemas.openxmlformats.org/wordprocessingml/2006/main" xmlns:w14="http://schemas.microsoft.com/office/word/2010/wordml" xmlns:w15="http://schemas.microsoft.com/office/word/2012/wordml" xmlns:w16cei="http://schemas.microsoft.com/office/word/2026/wordml/cei" xmlns:w16cex="http://schemas.microsoft.com/office/word/2018/wordml/cex" xmlns:w16cid="http://schemas.microsoft.com/office/word/2016/wordml/cid" xmlns:w16="http://schemas.microsoft.com/office/word/2018/wordml" xmlns:w16du="http://schemas.microsoft.com/office/word/2023/wordml/word16du" xmlns:w16sdtdh="http://schemas.microsoft.com/office/word/2020/wordml/sdtdatahash" xmlns:w16sdtfl="http://schemas.microsoft.com/office/word/2024/wordml/sdtformatlock" xmlns:w16se="http://schemas.microsoft.com/office/word/2015/wordml/symex" xmlns:wpg="http://schemas.microsoft.com/office/word/2010/wordprocessingGroup" xmlns:wpi="http://schemas.microsoft.com/office/word/2010/wordprocessingInk" xmlns:wne="http://schemas.microsoft.com/office/word/2006/wordml" xmlns:wps="http://schemas.microsoft.com/office/word/2010/wordprocessingShape" mc:Ignorable="w14 w15 w16se w16cid w16 w16cex w16sdtdh w16sdtfl w16du wp14">
+<w:ftr xmlns:wpc="http://schemas.microsoft.com/office/word/2010/wordprocessingCanvas" xmlns:cx="http://schemas.microsoft.com/office/drawing/2014/chartex" xmlns:cx1="http://schemas.microsoft.com/office/drawing/2015/9/8/chartex" xmlns:cx2="http://schemas.microsoft.com/office/drawing/2015/10/21/chartex" xmlns:cx3="http://schemas.microsoft.com/office/drawing/2016/5/9/chartex" xmlns:cx4="http://schemas.microsoft.com/office/drawing/2016/5/10/chartex" xmlns:cx5="http://schemas.microsoft.com/office/drawing/2016/5/11/chartex" xmlns:cx6="http://schemas.microsoft.com/office/drawing/2016/5/12/chartex" xmlns:cx7="http://schemas.microsoft.com/office/drawing/2016/5/13/chartex" xmlns:cx8="http://schemas.microsoft.com/office/drawing/2016/5/14/chartex" xmlns:mc="http://schemas.openxmlformats.org/markup-compatibility/2006" xmlns:aink="http://schemas.microsoft.com/office/drawing/2016/ink" xmlns:am3d="http://schemas.microsoft.com/office/drawing/2017/model3d" xmlns:o="urn:schemas-microsoft-com:office:office" xmlns:oel="http://schemas.microsoft.com/office/2019/extlst" xmlns:r="http://schemas.openxmlformats.org/officeDocument/2006/relationships" xmlns:m="http://schemas.openxmlformats.org/officeDocument/2006/math" xmlns:v="urn:schemas-microsoft-com:vml" xmlns:wp14="http://schemas.microsoft.com/office/word/2010/wordprocessingDrawing" xmlns:wp="http://schemas.openxmlformats.org/drawingml/2006/wordprocessingDrawing" xmlns:w10="urn:schemas-microsoft-com:office:word" xmlns:w="http://schemas.openxmlformats.org/wordprocessingml/2006/main" xmlns:w14="http://schemas.microsoft.com/office/word/2010/wordml" xmlns:w15="http://schemas.microsoft.com/office/word/2012/wordml" xmlns:w16cex="http://schemas.microsoft.com/office/word/2018/wordml/cex" xmlns:w16cid="http://schemas.microsoft.com/office/word/2016/wordml/cid" xmlns:w16="http://schemas.microsoft.com/office/word/2018/wordml" xmlns:w16du="http://schemas.microsoft.com/office/word/2023/wordml/word16du" xmlns:w16sdtdh="http://schemas.microsoft.com/office/word/2020/wordml/sdtdatahash" xmlns:w16sdtfl="http://schemas.microsoft.com/office/word/2024/wordml/sdtformatlock" xmlns:w16se="http://schemas.microsoft.com/office/word/2015/wordml/symex" xmlns:wpg="http://schemas.microsoft.com/office/word/2010/wordprocessingGroup" xmlns:wpi="http://schemas.microsoft.com/office/word/2010/wordprocessingInk" xmlns:wne="http://schemas.microsoft.com/office/word/2006/wordml" xmlns:wps="http://schemas.microsoft.com/office/word/2010/wordprocessingShape" mc:Ignorable="w14 w15 w16se w16cid w16 w16cex w16sdtdh w16sdtfl w16du wp14">
   <w:p>
     <w:pPr>
       <w:pStyle w:val="Footer"/>
@@ -3065,7 +3063,7 @@
 </file>
 
 <file path=word/footer4.xml><?xml version="1.0" encoding="utf-8"?>
-<w:ftr xmlns:wpc="http://schemas.microsoft.com/office/word/2010/wordprocessingCanvas" xmlns:cx="http://schemas.microsoft.com/office/drawing/2014/chartex" xmlns:cx1="http://schemas.microsoft.com/office/drawing/2015/9/8/chartex" xmlns:cx2="http://schemas.microsoft.com/office/drawing/2015/10/21/chartex" xmlns:cx3="http://schemas.microsoft.com/office/drawing/2016/5/9/chartex" xmlns:cx4="http://schemas.microsoft.com/office/drawing/2016/5/10/chartex" xmlns:cx5="http://schemas.microsoft.com/office/drawing/2016/5/11/chartex" xmlns:cx6="http://schemas.microsoft.com/office/drawing/2016/5/12/chartex" xmlns:cx7="http://schemas.microsoft.com/office/drawing/2016/5/13/chartex" xmlns:cx8="http://schemas.microsoft.com/office/drawing/2016/5/14/chartex" xmlns:mc="http://schemas.openxmlformats.org/markup-compatibility/2006" xmlns:aink="http://schemas.microsoft.com/office/drawing/2016/ink" xmlns:am3d="http://schemas.microsoft.com/office/drawing/2017/model3d" xmlns:o="urn:schemas-microsoft-com:office:office" xmlns:oel="http://schemas.microsoft.com/office/2019/extlst" xmlns:r="http://schemas.openxmlformats.org/officeDocument/2006/relationships" xmlns:m="http://schemas.openxmlformats.org/officeDocument/2006/math" xmlns:v="urn:schemas-microsoft-com:vml" xmlns:wp14="http://schemas.microsoft.com/office/word/2010/wordprocessingDrawing" xmlns:wp="http://schemas.openxmlformats.org/drawingml/2006/wordprocessingDrawing" xmlns:w10="urn:schemas-microsoft-com:office:word" xmlns:w="http://schemas.openxmlformats.org/wordprocessingml/2006/main" xmlns:w14="http://schemas.microsoft.com/office/word/2010/wordml" xmlns:w15="http://schemas.microsoft.com/office/word/2012/wordml" xmlns:w16cei="http://schemas.microsoft.com/office/word/2026/wordml/cei" xmlns:w16cex="http://schemas.microsoft.com/office/word/2018/wordml/cex" xmlns:w16cid="http://schemas.microsoft.com/office/word/2016/wordml/cid" xmlns:w16="http://schemas.microsoft.com/office/word/2018/wordml" xmlns:w16du="http://schemas.microsoft.com/office/word/2023/wordml/word16du" xmlns:w16sdtdh="http://schemas.microsoft.com/office/word/2020/wordml/sdtdatahash" xmlns:w16sdtfl="http://schemas.microsoft.com/office/word/2024/wordml/sdtformatlock" xmlns:w16se="http://schemas.microsoft.com/office/word/2015/wordml/symex" xmlns:wpg="http://schemas.microsoft.com/office/word/2010/wordprocessingGroup" xmlns:wpi="http://schemas.microsoft.com/office/word/2010/wordprocessingInk" xmlns:wne="http://schemas.microsoft.com/office/word/2006/wordml" xmlns:wps="http://schemas.microsoft.com/office/word/2010/wordprocessingShape" mc:Ignorable="w14 w15 w16se w16cid w16 w16cex w16sdtdh w16sdtfl w16du wp14">
+<w:ftr xmlns:wpc="http://schemas.microsoft.com/office/word/2010/wordprocessingCanvas" xmlns:cx="http://schemas.microsoft.com/office/drawing/2014/chartex" xmlns:cx1="http://schemas.microsoft.com/office/drawing/2015/9/8/chartex" xmlns:cx2="http://schemas.microsoft.com/office/drawing/2015/10/21/chartex" xmlns:cx3="http://schemas.microsoft.com/office/drawing/2016/5/9/chartex" xmlns:cx4="http://schemas.microsoft.com/office/drawing/2016/5/10/chartex" xmlns:cx5="http://schemas.microsoft.com/office/drawing/2016/5/11/chartex" xmlns:cx6="http://schemas.microsoft.com/office/drawing/2016/5/12/chartex" xmlns:cx7="http://schemas.microsoft.com/office/drawing/2016/5/13/chartex" xmlns:cx8="http://schemas.microsoft.com/office/drawing/2016/5/14/chartex" xmlns:mc="http://schemas.openxmlformats.org/markup-compatibility/2006" xmlns:aink="http://schemas.microsoft.com/office/drawing/2016/ink" xmlns:am3d="http://schemas.microsoft.com/office/drawing/2017/model3d" xmlns:o="urn:schemas-microsoft-com:office:office" xmlns:oel="http://schemas.microsoft.com/office/2019/extlst" xmlns:r="http://schemas.openxmlformats.org/officeDocument/2006/relationships" xmlns:m="http://schemas.openxmlformats.org/officeDocument/2006/math" xmlns:v="urn:schemas-microsoft-com:vml" xmlns:wp14="http://schemas.microsoft.com/office/word/2010/wordprocessingDrawing" xmlns:wp="http://schemas.openxmlformats.org/drawingml/2006/wordprocessingDrawing" xmlns:w10="urn:schemas-microsoft-com:office:word" xmlns:w="http://schemas.openxmlformats.org/wordprocessingml/2006/main" xmlns:w14="http://schemas.microsoft.com/office/word/2010/wordml" xmlns:w15="http://schemas.microsoft.com/office/word/2012/wordml" xmlns:w16cex="http://schemas.microsoft.com/office/word/2018/wordml/cex" xmlns:w16cid="http://schemas.microsoft.com/office/word/2016/wordml/cid" xmlns:w16="http://schemas.microsoft.com/office/word/2018/wordml" xmlns:w16du="http://schemas.microsoft.com/office/word/2023/wordml/word16du" xmlns:w16sdtdh="http://schemas.microsoft.com/office/word/2020/wordml/sdtdatahash" xmlns:w16sdtfl="http://schemas.microsoft.com/office/word/2024/wordml/sdtformatlock" xmlns:w16se="http://schemas.microsoft.com/office/word/2015/wordml/symex" xmlns:wpg="http://schemas.microsoft.com/office/word/2010/wordprocessingGroup" xmlns:wpi="http://schemas.microsoft.com/office/word/2010/wordprocessingInk" xmlns:wne="http://schemas.microsoft.com/office/word/2006/wordml" xmlns:wps="http://schemas.microsoft.com/office/word/2010/wordprocessingShape" mc:Ignorable="w14 w15 w16se w16cid w16 w16cex w16sdtdh w16sdtfl w16du wp14">
   <w:p>
     <w:pPr>
       <w:pStyle w:val="Footer"/>
@@ -3153,7 +3151,7 @@
 </file>
 
 <file path=word/footnotes.xml><?xml version="1.0" encoding="utf-8"?>
-<w:footnotes xmlns:wpc="http://schemas.microsoft.com/office/word/2010/wordprocessingCanvas" xmlns:cx="http://schemas.microsoft.com/office/drawing/2014/chartex" xmlns:cx1="http://schemas.microsoft.com/office/drawing/2015/9/8/chartex" xmlns:cx2="http://schemas.microsoft.com/office/drawing/2015/10/21/chartex" xmlns:cx3="http://schemas.microsoft.com/office/drawing/2016/5/9/chartex" xmlns:cx4="http://schemas.microsoft.com/office/drawing/2016/5/10/chartex" xmlns:cx5="http://schemas.microsoft.com/office/drawing/2016/5/11/chartex" xmlns:cx6="http://schemas.microsoft.com/office/drawing/2016/5/12/chartex" xmlns:cx7="http://schemas.microsoft.com/office/drawing/2016/5/13/chartex" xmlns:cx8="http://schemas.microsoft.com/office/drawing/2016/5/14/chartex" xmlns:mc="http://schemas.openxmlformats.org/markup-compatibility/2006" xmlns:aink="http://schemas.microsoft.com/office/drawing/2016/ink" xmlns:am3d="http://schemas.microsoft.com/office/drawing/2017/model3d" xmlns:o="urn:schemas-microsoft-com:office:office" xmlns:oel="http://schemas.microsoft.com/office/2019/extlst" xmlns:r="http://schemas.openxmlformats.org/officeDocument/2006/relationships" xmlns:m="http://schemas.openxmlformats.org/officeDocument/2006/math" xmlns:v="urn:schemas-microsoft-com:vml" xmlns:wp14="http://schemas.microsoft.com/office/word/2010/wordprocessingDrawing" xmlns:wp="http://schemas.openxmlformats.org/drawingml/2006/wordprocessingDrawing" xmlns:w10="urn:schemas-microsoft-com:office:word" xmlns:w="http://schemas.openxmlformats.org/wordprocessingml/2006/main" xmlns:w14="http://schemas.microsoft.com/office/word/2010/wordml" xmlns:w15="http://schemas.microsoft.com/office/word/2012/wordml" xmlns:w16cei="http://schemas.microsoft.com/office/word/2026/wordml/cei" xmlns:w16cex="http://schemas.microsoft.com/office/word/2018/wordml/cex" xmlns:w16cid="http://schemas.microsoft.com/office/word/2016/wordml/cid" xmlns:w16="http://schemas.microsoft.com/office/word/2018/wordml" xmlns:w16du="http://schemas.microsoft.com/office/word/2023/wordml/word16du" xmlns:w16sdtdh="http://schemas.microsoft.com/office/word/2020/wordml/sdtdatahash" xmlns:w16sdtfl="http://schemas.microsoft.com/office/word/2024/wordml/sdtformatlock" xmlns:w16se="http://schemas.microsoft.com/office/word/2015/wordml/symex" xmlns:wpg="http://schemas.microsoft.com/office/word/2010/wordprocessingGroup" xmlns:wpi="http://schemas.microsoft.com/office/word/2010/wordprocessingInk" xmlns:wne="http://schemas.microsoft.com/office/word/2006/wordml" xmlns:wps="http://schemas.microsoft.com/office/word/2010/wordprocessingShape" mc:Ignorable="w14 w15 w16se w16cid w16 w16cex w16sdtdh w16sdtfl w16du wp14">
+<w:footnotes xmlns:wpc="http://schemas.microsoft.com/office/word/2010/wordprocessingCanvas" xmlns:cx="http://schemas.microsoft.com/office/drawing/2014/chartex" xmlns:cx1="http://schemas.microsoft.com/office/drawing/2015/9/8/chartex" xmlns:cx2="http://schemas.microsoft.com/office/drawing/2015/10/21/chartex" xmlns:cx3="http://schemas.microsoft.com/office/drawing/2016/5/9/chartex" xmlns:cx4="http://schemas.microsoft.com/office/drawing/2016/5/10/chartex" xmlns:cx5="http://schemas.microsoft.com/office/drawing/2016/5/11/chartex" xmlns:cx6="http://schemas.microsoft.com/office/drawing/2016/5/12/chartex" xmlns:cx7="http://schemas.microsoft.com/office/drawing/2016/5/13/chartex" xmlns:cx8="http://schemas.microsoft.com/office/drawing/2016/5/14/chartex" xmlns:mc="http://schemas.openxmlformats.org/markup-compatibility/2006" xmlns:aink="http://schemas.microsoft.com/office/drawing/2016/ink" xmlns:am3d="http://schemas.microsoft.com/office/drawing/2017/model3d" xmlns:o="urn:schemas-microsoft-com:office:office" xmlns:oel="http://schemas.microsoft.com/office/2019/extlst" xmlns:r="http://schemas.openxmlformats.org/officeDocument/2006/relationships" xmlns:m="http://schemas.openxmlformats.org/officeDocument/2006/math" xmlns:v="urn:schemas-microsoft-com:vml" xmlns:wp14="http://schemas.microsoft.com/office/word/2010/wordprocessingDrawing" xmlns:wp="http://schemas.openxmlformats.org/drawingml/2006/wordprocessingDrawing" xmlns:w10="urn:schemas-microsoft-com:office:word" xmlns:w="http://schemas.openxmlformats.org/wordprocessingml/2006/main" xmlns:w14="http://schemas.microsoft.com/office/word/2010/wordml" xmlns:w15="http://schemas.microsoft.com/office/word/2012/wordml" xmlns:w16cex="http://schemas.microsoft.com/office/word/2018/wordml/cex" xmlns:w16cid="http://schemas.microsoft.com/office/word/2016/wordml/cid" xmlns:w16="http://schemas.microsoft.com/office/word/2018/wordml" xmlns:w16du="http://schemas.microsoft.com/office/word/2023/wordml/word16du" xmlns:w16sdtdh="http://schemas.microsoft.com/office/word/2020/wordml/sdtdatahash" xmlns:w16sdtfl="http://schemas.microsoft.com/office/word/2024/wordml/sdtformatlock" xmlns:w16se="http://schemas.microsoft.com/office/word/2015/wordml/symex" xmlns:wpg="http://schemas.microsoft.com/office/word/2010/wordprocessingGroup" xmlns:wpi="http://schemas.microsoft.com/office/word/2010/wordprocessingInk" xmlns:wne="http://schemas.microsoft.com/office/word/2006/wordml" xmlns:wps="http://schemas.microsoft.com/office/word/2010/wordprocessingShape" mc:Ignorable="w14 w15 w16se w16cid w16 w16cex w16sdtdh w16sdtfl w16du wp14">
   <w:footnote w:type="separator" w:id="-1">
     <w:p>
       <w:r>
@@ -3172,7 +3170,7 @@
 </file>
 
 <file path=word/header1.xml><?xml version="1.0" encoding="utf-8"?>
-<w:hdr xmlns:wpc="http://schemas.microsoft.com/office/word/2010/wordprocessingCanvas" xmlns:cx="http://schemas.microsoft.com/office/drawing/2014/chartex" xmlns:cx1="http://schemas.microsoft.com/office/drawing/2015/9/8/chartex" xmlns:cx2="http://schemas.microsoft.com/office/drawing/2015/10/21/chartex" xmlns:cx3="http://schemas.microsoft.com/office/drawing/2016/5/9/chartex" xmlns:cx4="http://schemas.microsoft.com/office/drawing/2016/5/10/chartex" xmlns:cx5="http://schemas.microsoft.com/office/drawing/2016/5/11/chartex" xmlns:cx6="http://schemas.microsoft.com/office/drawing/2016/5/12/chartex" xmlns:cx7="http://schemas.microsoft.com/office/drawing/2016/5/13/chartex" xmlns:cx8="http://schemas.microsoft.com/office/drawing/2016/5/14/chartex" xmlns:mc="http://schemas.openxmlformats.org/markup-compatibility/2006" xmlns:aink="http://schemas.microsoft.com/office/drawing/2016/ink" xmlns:am3d="http://schemas.microsoft.com/office/drawing/2017/model3d" xmlns:o="urn:schemas-microsoft-com:office:office" xmlns:oel="http://schemas.microsoft.com/office/2019/extlst" xmlns:r="http://schemas.openxmlformats.org/officeDocument/2006/relationships" xmlns:m="http://schemas.openxmlformats.org/officeDocument/2006/math" xmlns:v="urn:schemas-microsoft-com:vml" xmlns:wp14="http://schemas.microsoft.com/office/word/2010/wordprocessingDrawing" xmlns:wp="http://schemas.openxmlformats.org/drawingml/2006/wordprocessingDrawing" xmlns:w10="urn:schemas-microsoft-com:office:word" xmlns:w="http://schemas.openxmlformats.org/wordprocessingml/2006/main" xmlns:w14="http://schemas.microsoft.com/office/word/2010/wordml" xmlns:w15="http://schemas.microsoft.com/office/word/2012/wordml" xmlns:w16cei="http://schemas.microsoft.com/office/word/2026/wordml/cei" xmlns:w16cex="http://schemas.microsoft.com/office/word/2018/wordml/cex" xmlns:w16cid="http://schemas.microsoft.com/office/word/2016/wordml/cid" xmlns:w16="http://schemas.microsoft.com/office/word/2018/wordml" xmlns:w16du="http://schemas.microsoft.com/office/word/2023/wordml/word16du" xmlns:w16sdtdh="http://schemas.microsoft.com/office/word/2020/wordml/sdtdatahash" xmlns:w16sdtfl="http://schemas.microsoft.com/office/word/2024/wordml/sdtformatlock" xmlns:w16se="http://schemas.microsoft.com/office/word/2015/wordml/symex" xmlns:wpg="http://schemas.microsoft.com/office/word/2010/wordprocessingGroup" xmlns:wpi="http://schemas.microsoft.com/office/word/2010/wordprocessingInk" xmlns:wne="http://schemas.microsoft.com/office/word/2006/wordml" xmlns:wps="http://schemas.microsoft.com/office/word/2010/wordprocessingShape" mc:Ignorable="w14 w15 w16se w16cid w16 w16cex w16sdtdh w16sdtfl w16du wp14">
+<w:hdr xmlns:wpc="http://schemas.microsoft.com/office/word/2010/wordprocessingCanvas" xmlns:cx="http://schemas.microsoft.com/office/drawing/2014/chartex" xmlns:cx1="http://schemas.microsoft.com/office/drawing/2015/9/8/chartex" xmlns:cx2="http://schemas.microsoft.com/office/drawing/2015/10/21/chartex" xmlns:cx3="http://schemas.microsoft.com/office/drawing/2016/5/9/chartex" xmlns:cx4="http://schemas.microsoft.com/office/drawing/2016/5/10/chartex" xmlns:cx5="http://schemas.microsoft.com/office/drawing/2016/5/11/chartex" xmlns:cx6="http://schemas.microsoft.com/office/drawing/2016/5/12/chartex" xmlns:cx7="http://schemas.microsoft.com/office/drawing/2016/5/13/chartex" xmlns:cx8="http://schemas.microsoft.com/office/drawing/2016/5/14/chartex" xmlns:mc="http://schemas.openxmlformats.org/markup-compatibility/2006" xmlns:aink="http://schemas.microsoft.com/office/drawing/2016/ink" xmlns:am3d="http://schemas.microsoft.com/office/drawing/2017/model3d" xmlns:o="urn:schemas-microsoft-com:office:office" xmlns:oel="http://schemas.microsoft.com/office/2019/extlst" xmlns:r="http://schemas.openxmlformats.org/officeDocument/2006/relationships" xmlns:m="http://schemas.openxmlformats.org/officeDocument/2006/math" xmlns:v="urn:schemas-microsoft-com:vml" xmlns:wp14="http://schemas.microsoft.com/office/word/2010/wordprocessingDrawing" xmlns:wp="http://schemas.openxmlformats.org/drawingml/2006/wordprocessingDrawing" xmlns:w10="urn:schemas-microsoft-com:office:word" xmlns:w="http://schemas.openxmlformats.org/wordprocessingml/2006/main" xmlns:w14="http://schemas.microsoft.com/office/word/2010/wordml" xmlns:w15="http://schemas.microsoft.com/office/word/2012/wordml" xmlns:w16cex="http://schemas.microsoft.com/office/word/2018/wordml/cex" xmlns:w16cid="http://schemas.microsoft.com/office/word/2016/wordml/cid" xmlns:w16="http://schemas.microsoft.com/office/word/2018/wordml" xmlns:w16du="http://schemas.microsoft.com/office/word/2023/wordml/word16du" xmlns:w16sdtdh="http://schemas.microsoft.com/office/word/2020/wordml/sdtdatahash" xmlns:w16sdtfl="http://schemas.microsoft.com/office/word/2024/wordml/sdtformatlock" xmlns:w16se="http://schemas.microsoft.com/office/word/2015/wordml/symex" xmlns:wpg="http://schemas.microsoft.com/office/word/2010/wordprocessingGroup" xmlns:wpi="http://schemas.microsoft.com/office/word/2010/wordprocessingInk" xmlns:wne="http://schemas.microsoft.com/office/word/2006/wordml" xmlns:wps="http://schemas.microsoft.com/office/word/2010/wordprocessingShape" mc:Ignorable="w14 w15 w16se w16cid w16 w16cex w16sdtdh w16sdtfl w16du wp14">
   <w:p>
     <w:pPr>
       <w:pStyle w:val="Header"/>
@@ -3182,7 +3180,7 @@
 </file>
 
 <file path=word/header2.xml><?xml version="1.0" encoding="utf-8"?>
-<w:hdr xmlns:wpc="http://schemas.microsoft.com/office/word/2010/wordprocessingCanvas" xmlns:cx="http://schemas.microsoft.com/office/drawing/2014/chartex" xmlns:cx1="http://schemas.microsoft.com/office/drawing/2015/9/8/chartex" xmlns:cx2="http://schemas.microsoft.com/office/drawing/2015/10/21/chartex" xmlns:cx3="http://schemas.microsoft.com/office/drawing/2016/5/9/chartex" xmlns:cx4="http://schemas.microsoft.com/office/drawing/2016/5/10/chartex" xmlns:cx5="http://schemas.microsoft.com/office/drawing/2016/5/11/chartex" xmlns:cx6="http://schemas.microsoft.com/office/drawing/2016/5/12/chartex" xmlns:cx7="http://schemas.microsoft.com/office/drawing/2016/5/13/chartex" xmlns:cx8="http://schemas.microsoft.com/office/drawing/2016/5/14/chartex" xmlns:mc="http://schemas.openxmlformats.org/markup-compatibility/2006" xmlns:aink="http://schemas.microsoft.com/office/drawing/2016/ink" xmlns:am3d="http://schemas.microsoft.com/office/drawing/2017/model3d" xmlns:o="urn:schemas-microsoft-com:office:office" xmlns:oel="http://schemas.microsoft.com/office/2019/extlst" xmlns:r="http://schemas.openxmlformats.org/officeDocument/2006/relationships" xmlns:m="http://schemas.openxmlformats.org/officeDocument/2006/math" xmlns:v="urn:schemas-microsoft-com:vml" xmlns:wp14="http://schemas.microsoft.com/office/word/2010/wordprocessingDrawing" xmlns:wp="http://schemas.openxmlformats.org/drawingml/2006/wordprocessingDrawing" xmlns:w10="urn:schemas-microsoft-com:office:word" xmlns:w="http://schemas.openxmlformats.org/wordprocessingml/2006/main" xmlns:w14="http://schemas.microsoft.com/office/word/2010/wordml" xmlns:w15="http://schemas.microsoft.com/office/word/2012/wordml" xmlns:w16cei="http://schemas.microsoft.com/office/word/2026/wordml/cei" xmlns:w16cex="http://schemas.microsoft.com/office/word/2018/wordml/cex" xmlns:w16cid="http://schemas.microsoft.com/office/word/2016/wordml/cid" xmlns:w16="http://schemas.microsoft.com/office/word/2018/wordml" xmlns:w16du="http://schemas.microsoft.com/office/word/2023/wordml/word16du" xmlns:w16sdtdh="http://schemas.microsoft.com/office/word/2020/wordml/sdtdatahash" xmlns:w16sdtfl="http://schemas.microsoft.com/office/word/2024/wordml/sdtformatlock" xmlns:w16se="http://schemas.microsoft.com/office/word/2015/wordml/symex" xmlns:wpg="http://schemas.microsoft.com/office/word/2010/wordprocessingGroup" xmlns:wpi="http://schemas.microsoft.com/office/word/2010/wordprocessingInk" xmlns:wne="http://schemas.microsoft.com/office/word/2006/wordml" xmlns:wps="http://schemas.microsoft.com/office/word/2010/wordprocessingShape" mc:Ignorable="w14 w15 w16se w16cid w16 w16cex w16sdtdh w16sdtfl w16du wp14">
+<w:hdr xmlns:wpc="http://schemas.microsoft.com/office/word/2010/wordprocessingCanvas" xmlns:cx="http://schemas.microsoft.com/office/drawing/2014/chartex" xmlns:cx1="http://schemas.microsoft.com/office/drawing/2015/9/8/chartex" xmlns:cx2="http://schemas.microsoft.com/office/drawing/2015/10/21/chartex" xmlns:cx3="http://schemas.microsoft.com/office/drawing/2016/5/9/chartex" xmlns:cx4="http://schemas.microsoft.com/office/drawing/2016/5/10/chartex" xmlns:cx5="http://schemas.microsoft.com/office/drawing/2016/5/11/chartex" xmlns:cx6="http://schemas.microsoft.com/office/drawing/2016/5/12/chartex" xmlns:cx7="http://schemas.microsoft.com/office/drawing/2016/5/13/chartex" xmlns:cx8="http://schemas.microsoft.com/office/drawing/2016/5/14/chartex" xmlns:mc="http://schemas.openxmlformats.org/markup-compatibility/2006" xmlns:aink="http://schemas.microsoft.com/office/drawing/2016/ink" xmlns:am3d="http://schemas.microsoft.com/office/drawing/2017/model3d" xmlns:o="urn:schemas-microsoft-com:office:office" xmlns:oel="http://schemas.microsoft.com/office/2019/extlst" xmlns:r="http://schemas.openxmlformats.org/officeDocument/2006/relationships" xmlns:m="http://schemas.openxmlformats.org/officeDocument/2006/math" xmlns:v="urn:schemas-microsoft-com:vml" xmlns:wp14="http://schemas.microsoft.com/office/word/2010/wordprocessingDrawing" xmlns:wp="http://schemas.openxmlformats.org/drawingml/2006/wordprocessingDrawing" xmlns:w10="urn:schemas-microsoft-com:office:word" xmlns:w="http://schemas.openxmlformats.org/wordprocessingml/2006/main" xmlns:w14="http://schemas.microsoft.com/office/word/2010/wordml" xmlns:w15="http://schemas.microsoft.com/office/word/2012/wordml" xmlns:w16cex="http://schemas.microsoft.com/office/word/2018/wordml/cex" xmlns:w16cid="http://schemas.microsoft.com/office/word/2016/wordml/cid" xmlns:w16="http://schemas.microsoft.com/office/word/2018/wordml" xmlns:w16du="http://schemas.microsoft.com/office/word/2023/wordml/word16du" xmlns:w16sdtdh="http://schemas.microsoft.com/office/word/2020/wordml/sdtdatahash" xmlns:w16sdtfl="http://schemas.microsoft.com/office/word/2024/wordml/sdtformatlock" xmlns:w16se="http://schemas.microsoft.com/office/word/2015/wordml/symex" xmlns:wpg="http://schemas.microsoft.com/office/word/2010/wordprocessingGroup" xmlns:wpi="http://schemas.microsoft.com/office/word/2010/wordprocessingInk" xmlns:wne="http://schemas.microsoft.com/office/word/2006/wordml" xmlns:wps="http://schemas.microsoft.com/office/word/2010/wordprocessingShape" mc:Ignorable="w14 w15 w16se w16cid w16 w16cex w16sdtdh w16sdtfl w16du wp14">
   <w:p>
     <w:pPr>
       <w:pStyle w:val="Header"/>
@@ -3192,7 +3190,7 @@
 </file>
 
 <file path=word/header3.xml><?xml version="1.0" encoding="utf-8"?>
-<w:hdr xmlns:wpc="http://schemas.microsoft.com/office/word/2010/wordprocessingCanvas" xmlns:cx="http://schemas.microsoft.com/office/drawing/2014/chartex" xmlns:cx1="http://schemas.microsoft.com/office/drawing/2015/9/8/chartex" xmlns:cx2="http://schemas.microsoft.com/office/drawing/2015/10/21/chartex" xmlns:cx3="http://schemas.microsoft.com/office/drawing/2016/5/9/chartex" xmlns:cx4="http://schemas.microsoft.com/office/drawing/2016/5/10/chartex" xmlns:cx5="http://schemas.microsoft.com/office/drawing/2016/5/11/chartex" xmlns:cx6="http://schemas.microsoft.com/office/drawing/2016/5/12/chartex" xmlns:cx7="http://schemas.microsoft.com/office/drawing/2016/5/13/chartex" xmlns:cx8="http://schemas.microsoft.com/office/drawing/2016/5/14/chartex" xmlns:mc="http://schemas.openxmlformats.org/markup-compatibility/2006" xmlns:aink="http://schemas.microsoft.com/office/drawing/2016/ink" xmlns:am3d="http://schemas.microsoft.com/office/drawing/2017/model3d" xmlns:o="urn:schemas-microsoft-com:office:office" xmlns:oel="http://schemas.microsoft.com/office/2019/extlst" xmlns:r="http://schemas.openxmlformats.org/officeDocument/2006/relationships" xmlns:m="http://schemas.openxmlformats.org/officeDocument/2006/math" xmlns:v="urn:schemas-microsoft-com:vml" xmlns:wp14="http://schemas.microsoft.com/office/word/2010/wordprocessingDrawing" xmlns:wp="http://schemas.openxmlformats.org/drawingml/2006/wordprocessingDrawing" xmlns:w10="urn:schemas-microsoft-com:office:word" xmlns:w="http://schemas.openxmlformats.org/wordprocessingml/2006/main" xmlns:w14="http://schemas.microsoft.com/office/word/2010/wordml" xmlns:w15="http://schemas.microsoft.com/office/word/2012/wordml" xmlns:w16cei="http://schemas.microsoft.com/office/word/2026/wordml/cei" xmlns:w16cex="http://schemas.microsoft.com/office/word/2018/wordml/cex" xmlns:w16cid="http://schemas.microsoft.com/office/word/2016/wordml/cid" xmlns:w16="http://schemas.microsoft.com/office/word/2018/wordml" xmlns:w16du="http://schemas.microsoft.com/office/word/2023/wordml/word16du" xmlns:w16sdtdh="http://schemas.microsoft.com/office/word/2020/wordml/sdtdatahash" xmlns:w16sdtfl="http://schemas.microsoft.com/office/word/2024/wordml/sdtformatlock" xmlns:w16se="http://schemas.microsoft.com/office/word/2015/wordml/symex" xmlns:wpg="http://schemas.microsoft.com/office/word/2010/wordprocessingGroup" xmlns:wpi="http://schemas.microsoft.com/office/word/2010/wordprocessingInk" xmlns:wne="http://schemas.microsoft.com/office/word/2006/wordml" xmlns:wps="http://schemas.microsoft.com/office/word/2010/wordprocessingShape" mc:Ignorable="w14 w15 w16se w16cid w16 w16cex w16sdtdh w16sdtfl w16du wp14">
+<w:hdr xmlns:wpc="http://schemas.microsoft.com/office/word/2010/wordprocessingCanvas" xmlns:cx="http://schemas.microsoft.com/office/drawing/2014/chartex" xmlns:cx1="http://schemas.microsoft.com/office/drawing/2015/9/8/chartex" xmlns:cx2="http://schemas.microsoft.com/office/drawing/2015/10/21/chartex" xmlns:cx3="http://schemas.microsoft.com/office/drawing/2016/5/9/chartex" xmlns:cx4="http://schemas.microsoft.com/office/drawing/2016/5/10/chartex" xmlns:cx5="http://schemas.microsoft.com/office/drawing/2016/5/11/chartex" xmlns:cx6="http://schemas.microsoft.com/office/drawing/2016/5/12/chartex" xmlns:cx7="http://schemas.microsoft.com/office/drawing/2016/5/13/chartex" xmlns:cx8="http://schemas.microsoft.com/office/drawing/2016/5/14/chartex" xmlns:mc="http://schemas.openxmlformats.org/markup-compatibility/2006" xmlns:aink="http://schemas.microsoft.com/office/drawing/2016/ink" xmlns:am3d="http://schemas.microsoft.com/office/drawing/2017/model3d" xmlns:o="urn:schemas-microsoft-com:office:office" xmlns:oel="http://schemas.microsoft.com/office/2019/extlst" xmlns:r="http://schemas.openxmlformats.org/officeDocument/2006/relationships" xmlns:m="http://schemas.openxmlformats.org/officeDocument/2006/math" xmlns:v="urn:schemas-microsoft-com:vml" xmlns:wp14="http://schemas.microsoft.com/office/word/2010/wordprocessingDrawing" xmlns:wp="http://schemas.openxmlformats.org/drawingml/2006/wordprocessingDrawing" xmlns:w10="urn:schemas-microsoft-com:office:word" xmlns:w="http://schemas.openxmlformats.org/wordprocessingml/2006/main" xmlns:w14="http://schemas.microsoft.com/office/word/2010/wordml" xmlns:w15="http://schemas.microsoft.com/office/word/2012/wordml" xmlns:w16cex="http://schemas.microsoft.com/office/word/2018/wordml/cex" xmlns:w16cid="http://schemas.microsoft.com/office/word/2016/wordml/cid" xmlns:w16="http://schemas.microsoft.com/office/word/2018/wordml" xmlns:w16du="http://schemas.microsoft.com/office/word/2023/wordml/word16du" xmlns:w16sdtdh="http://schemas.microsoft.com/office/word/2020/wordml/sdtdatahash" xmlns:w16sdtfl="http://schemas.microsoft.com/office/word/2024/wordml/sdtformatlock" xmlns:w16se="http://schemas.microsoft.com/office/word/2015/wordml/symex" xmlns:wpg="http://schemas.microsoft.com/office/word/2010/wordprocessingGroup" xmlns:wpi="http://schemas.microsoft.com/office/word/2010/wordprocessingInk" xmlns:wne="http://schemas.microsoft.com/office/word/2006/wordml" xmlns:wps="http://schemas.microsoft.com/office/word/2010/wordprocessingShape" mc:Ignorable="w14 w15 w16se w16cid w16 w16cex w16sdtdh w16sdtfl w16du wp14">
   <w:p>
     <w:pPr>
       <w:pStyle w:val="Header"/>
@@ -3202,7 +3200,7 @@
 </file>
 
 <file path=word/header4.xml><?xml version="1.0" encoding="utf-8"?>
-<w:hdr xmlns:wpc="http://schemas.microsoft.com/office/word/2010/wordprocessingCanvas" xmlns:cx="http://schemas.microsoft.com/office/drawing/2014/chartex" xmlns:cx1="http://schemas.microsoft.com/office/drawing/2015/9/8/chartex" xmlns:cx2="http://schemas.microsoft.com/office/drawing/2015/10/21/chartex" xmlns:cx3="http://schemas.microsoft.com/office/drawing/2016/5/9/chartex" xmlns:cx4="http://schemas.microsoft.com/office/drawing/2016/5/10/chartex" xmlns:cx5="http://schemas.microsoft.com/office/drawing/2016/5/11/chartex" xmlns:cx6="http://schemas.microsoft.com/office/drawing/2016/5/12/chartex" xmlns:cx7="http://schemas.microsoft.com/office/drawing/2016/5/13/chartex" xmlns:cx8="http://schemas.microsoft.com/office/drawing/2016/5/14/chartex" xmlns:mc="http://schemas.openxmlformats.org/markup-compatibility/2006" xmlns:aink="http://schemas.microsoft.com/office/drawing/2016/ink" xmlns:am3d="http://schemas.microsoft.com/office/drawing/2017/model3d" xmlns:o="urn:schemas-microsoft-com:office:office" xmlns:oel="http://schemas.microsoft.com/office/2019/extlst" xmlns:r="http://schemas.openxmlformats.org/officeDocument/2006/relationships" xmlns:m="http://schemas.openxmlformats.org/officeDocument/2006/math" xmlns:v="urn:schemas-microsoft-com:vml" xmlns:wp14="http://schemas.microsoft.com/office/word/2010/wordprocessingDrawing" xmlns:wp="http://schemas.openxmlformats.org/drawingml/2006/wordprocessingDrawing" xmlns:w10="urn:schemas-microsoft-com:office:word" xmlns:w="http://schemas.openxmlformats.org/wordprocessingml/2006/main" xmlns:w14="http://schemas.microsoft.com/office/word/2010/wordml" xmlns:w15="http://schemas.microsoft.com/office/word/2012/wordml" xmlns:w16cei="http://schemas.microsoft.com/office/word/2026/wordml/cei" xmlns:w16cex="http://schemas.microsoft.com/office/word/2018/wordml/cex" xmlns:w16cid="http://schemas.microsoft.com/office/word/2016/wordml/cid" xmlns:w16="http://schemas.microsoft.com/office/word/2018/wordml" xmlns:w16du="http://schemas.microsoft.com/office/word/2023/wordml/word16du" xmlns:w16sdtdh="http://schemas.microsoft.com/office/word/2020/wordml/sdtdatahash" xmlns:w16sdtfl="http://schemas.microsoft.com/office/word/2024/wordml/sdtformatlock" xmlns:w16se="http://schemas.microsoft.com/office/word/2015/wordml/symex" xmlns:wpg="http://schemas.microsoft.com/office/word/2010/wordprocessingGroup" xmlns:wpi="http://schemas.microsoft.com/office/word/2010/wordprocessingInk" xmlns:wne="http://schemas.microsoft.com/office/word/2006/wordml" xmlns:wps="http://schemas.microsoft.com/office/word/2010/wordprocessingShape" mc:Ignorable="w14 w15 w16se w16cid w16 w16cex w16sdtdh w16sdtfl w16du wp14">
+<w:hdr xmlns:wpc="http://schemas.microsoft.com/office/word/2010/wordprocessingCanvas" xmlns:cx="http://schemas.microsoft.com/office/drawing/2014/chartex" xmlns:cx1="http://schemas.microsoft.com/office/drawing/2015/9/8/chartex" xmlns:cx2="http://schemas.microsoft.com/office/drawing/2015/10/21/chartex" xmlns:cx3="http://schemas.microsoft.com/office/drawing/2016/5/9/chartex" xmlns:cx4="http://schemas.microsoft.com/office/drawing/2016/5/10/chartex" xmlns:cx5="http://schemas.microsoft.com/office/drawing/2016/5/11/chartex" xmlns:cx6="http://schemas.microsoft.com/office/drawing/2016/5/12/chartex" xmlns:cx7="http://schemas.microsoft.com/office/drawing/2016/5/13/chartex" xmlns:cx8="http://schemas.microsoft.com/office/drawing/2016/5/14/chartex" xmlns:mc="http://schemas.openxmlformats.org/markup-compatibility/2006" xmlns:aink="http://schemas.microsoft.com/office/drawing/2016/ink" xmlns:am3d="http://schemas.microsoft.com/office/drawing/2017/model3d" xmlns:o="urn:schemas-microsoft-com:office:office" xmlns:oel="http://schemas.microsoft.com/office/2019/extlst" xmlns:r="http://schemas.openxmlformats.org/officeDocument/2006/relationships" xmlns:m="http://schemas.openxmlformats.org/officeDocument/2006/math" xmlns:v="urn:schemas-microsoft-com:vml" xmlns:wp14="http://schemas.microsoft.com/office/word/2010/wordprocessingDrawing" xmlns:wp="http://schemas.openxmlformats.org/drawingml/2006/wordprocessingDrawing" xmlns:w10="urn:schemas-microsoft-com:office:word" xmlns:w="http://schemas.openxmlformats.org/wordprocessingml/2006/main" xmlns:w14="http://schemas.microsoft.com/office/word/2010/wordml" xmlns:w15="http://schemas.microsoft.com/office/word/2012/wordml" xmlns:w16cex="http://schemas.microsoft.com/office/word/2018/wordml/cex" xmlns:w16cid="http://schemas.microsoft.com/office/word/2016/wordml/cid" xmlns:w16="http://schemas.microsoft.com/office/word/2018/wordml" xmlns:w16du="http://schemas.microsoft.com/office/word/2023/wordml/word16du" xmlns:w16sdtdh="http://schemas.microsoft.com/office/word/2020/wordml/sdtdatahash" xmlns:w16sdtfl="http://schemas.microsoft.com/office/word/2024/wordml/sdtformatlock" xmlns:w16se="http://schemas.microsoft.com/office/word/2015/wordml/symex" xmlns:wpg="http://schemas.microsoft.com/office/word/2010/wordprocessingGroup" xmlns:wpi="http://schemas.microsoft.com/office/word/2010/wordprocessingInk" xmlns:wne="http://schemas.microsoft.com/office/word/2006/wordml" xmlns:wps="http://schemas.microsoft.com/office/word/2010/wordprocessingShape" mc:Ignorable="w14 w15 w16se w16cid w16 w16cex w16sdtdh w16sdtfl w16du wp14">
   <w:p>
     <w:pPr>
       <w:pStyle w:val="Header"/>
@@ -3235,7 +3233,7 @@
 </file>
 
 <file path=word/numbering.xml><?xml version="1.0" encoding="utf-8"?>
-<w:numbering xmlns:wpc="http://schemas.microsoft.com/office/word/2010/wordprocessingCanvas" xmlns:cx="http://schemas.microsoft.com/office/drawing/2014/chartex" xmlns:cx1="http://schemas.microsoft.com/office/drawing/2015/9/8/chartex" xmlns:cx2="http://schemas.microsoft.com/office/drawing/2015/10/21/chartex" xmlns:cx3="http://schemas.microsoft.com/office/drawing/2016/5/9/chartex" xmlns:cx4="http://schemas.microsoft.com/office/drawing/2016/5/10/chartex" xmlns:cx5="http://schemas.microsoft.com/office/drawing/2016/5/11/chartex" xmlns:cx6="http://schemas.microsoft.com/office/drawing/2016/5/12/chartex" xmlns:cx7="http://schemas.microsoft.com/office/drawing/2016/5/13/chartex" xmlns:cx8="http://schemas.microsoft.com/office/drawing/2016/5/14/chartex" xmlns:mc="http://schemas.openxmlformats.org/markup-compatibility/2006" xmlns:aink="http://schemas.microsoft.com/office/drawing/2016/ink" xmlns:am3d="http://schemas.microsoft.com/office/drawing/2017/model3d" xmlns:o="urn:schemas-microsoft-com:office:office" xmlns:oel="http://schemas.microsoft.com/office/2019/extlst" xmlns:r="http://schemas.openxmlformats.org/officeDocument/2006/relationships" xmlns:m="http://schemas.openxmlformats.org/officeDocument/2006/math" xmlns:v="urn:schemas-microsoft-com:vml" xmlns:wp14="http://schemas.microsoft.com/office/word/2010/wordprocessingDrawing" xmlns:wp="http://schemas.openxmlformats.org/drawingml/2006/wordprocessingDrawing" xmlns:w10="urn:schemas-microsoft-com:office:word" xmlns:w="http://schemas.openxmlformats.org/wordprocessingml/2006/main" xmlns:w14="http://schemas.microsoft.com/office/word/2010/wordml" xmlns:w15="http://schemas.microsoft.com/office/word/2012/wordml" xmlns:w16cei="http://schemas.microsoft.com/office/word/2026/wordml/cei" xmlns:w16cex="http://schemas.microsoft.com/office/word/2018/wordml/cex" xmlns:w16cid="http://schemas.microsoft.com/office/word/2016/wordml/cid" xmlns:w16="http://schemas.microsoft.com/office/word/2018/wordml" xmlns:w16du="http://schemas.microsoft.com/office/word/2023/wordml/word16du" xmlns:w16sdtdh="http://schemas.microsoft.com/office/word/2020/wordml/sdtdatahash" xmlns:w16sdtfl="http://schemas.microsoft.com/office/word/2024/wordml/sdtformatlock" xmlns:w16se="http://schemas.microsoft.com/office/word/2015/wordml/symex" xmlns:wpg="http://schemas.microsoft.com/office/word/2010/wordprocessingGroup" xmlns:wpi="http://schemas.microsoft.com/office/word/2010/wordprocessingInk" xmlns:wne="http://schemas.microsoft.com/office/word/2006/wordml" xmlns:wps="http://schemas.microsoft.com/office/word/2010/wordprocessingShape" mc:Ignorable="w14 w15 w16se w16cid w16 w16cex w16sdtdh w16sdtfl w16du wp14">
+<w:numbering xmlns:wpc="http://schemas.microsoft.com/office/word/2010/wordprocessingCanvas" xmlns:cx="http://schemas.microsoft.com/office/drawing/2014/chartex" xmlns:cx1="http://schemas.microsoft.com/office/drawing/2015/9/8/chartex" xmlns:cx2="http://schemas.microsoft.com/office/drawing/2015/10/21/chartex" xmlns:cx3="http://schemas.microsoft.com/office/drawing/2016/5/9/chartex" xmlns:cx4="http://schemas.microsoft.com/office/drawing/2016/5/10/chartex" xmlns:cx5="http://schemas.microsoft.com/office/drawing/2016/5/11/chartex" xmlns:cx6="http://schemas.microsoft.com/office/drawing/2016/5/12/chartex" xmlns:cx7="http://schemas.microsoft.com/office/drawing/2016/5/13/chartex" xmlns:cx8="http://schemas.microsoft.com/office/drawing/2016/5/14/chartex" xmlns:mc="http://schemas.openxmlformats.org/markup-compatibility/2006" xmlns:aink="http://schemas.microsoft.com/office/drawing/2016/ink" xmlns:am3d="http://schemas.microsoft.com/office/drawing/2017/model3d" xmlns:o="urn:schemas-microsoft-com:office:office" xmlns:oel="http://schemas.microsoft.com/office/2019/extlst" xmlns:r="http://schemas.openxmlformats.org/officeDocument/2006/relationships" xmlns:m="http://schemas.openxmlformats.org/officeDocument/2006/math" xmlns:v="urn:schemas-microsoft-com:vml" xmlns:wp14="http://schemas.microsoft.com/office/word/2010/wordprocessingDrawing" xmlns:wp="http://schemas.openxmlformats.org/drawingml/2006/wordprocessingDrawing" xmlns:w10="urn:schemas-microsoft-com:office:word" xmlns:w="http://schemas.openxmlformats.org/wordprocessingml/2006/main" xmlns:w14="http://schemas.microsoft.com/office/word/2010/wordml" xmlns:w15="http://schemas.microsoft.com/office/word/2012/wordml" xmlns:w16cex="http://schemas.microsoft.com/office/word/2018/wordml/cex" xmlns:w16cid="http://schemas.microsoft.com/office/word/2016/wordml/cid" xmlns:w16="http://schemas.microsoft.com/office/word/2018/wordml" xmlns:w16du="http://schemas.microsoft.com/office/word/2023/wordml/word16du" xmlns:w16sdtdh="http://schemas.microsoft.com/office/word/2020/wordml/sdtdatahash" xmlns:w16sdtfl="http://schemas.microsoft.com/office/word/2024/wordml/sdtformatlock" xmlns:w16se="http://schemas.microsoft.com/office/word/2015/wordml/symex" xmlns:wpg="http://schemas.microsoft.com/office/word/2010/wordprocessingGroup" xmlns:wpi="http://schemas.microsoft.com/office/word/2010/wordprocessingInk" xmlns:wne="http://schemas.microsoft.com/office/word/2006/wordml" xmlns:wps="http://schemas.microsoft.com/office/word/2010/wordprocessingShape" mc:Ignorable="w14 w15 w16se w16cid w16 w16cex w16sdtdh w16sdtfl w16du wp14">
   <w:abstractNum w:abstractNumId="0" w15:restartNumberingAfterBreak="0">
     <w:nsid w:val="034C2CCD"/>
     <w:multiLevelType w:val="multilevel"/>
@@ -7194,14 +7192,14 @@
       </w:rPr>
     </w:lvl>
   </w:abstractNum>
-  <w:num w:numId="1" w16cid:durableId="1944073819">
-    <w:abstractNumId w:val="24"/>
+  <w:num w:numId="1" w16cid:durableId="1115293059">
+    <w:abstractNumId w:val="21"/>
   </w:num>
   <w:num w:numId="2" w16cid:durableId="1171290678">
     <w:abstractNumId w:val="27"/>
   </w:num>
-  <w:num w:numId="3" w16cid:durableId="2114393891">
-    <w:abstractNumId w:val="18"/>
+  <w:num w:numId="3" w16cid:durableId="1217618102">
+    <w:abstractNumId w:val="16"/>
   </w:num>
   <w:num w:numId="4" w16cid:durableId="1481848834">
     <w:abstractNumId w:val="18"/>
@@ -7212,80 +7210,80 @@
       <w:startOverride w:val="1"/>
     </w:lvlOverride>
   </w:num>
-  <w:num w:numId="5" w16cid:durableId="1115293059">
-    <w:abstractNumId w:val="21"/>
+  <w:num w:numId="5" w16cid:durableId="1546798044">
+    <w:abstractNumId w:val="25"/>
   </w:num>
-  <w:num w:numId="6" w16cid:durableId="2114670366">
-    <w:abstractNumId w:val="7"/>
-  </w:num>
-  <w:num w:numId="7" w16cid:durableId="1945261314">
-    <w:abstractNumId w:val="9"/>
-  </w:num>
-  <w:num w:numId="8" w16cid:durableId="1632175038">
+  <w:num w:numId="6" w16cid:durableId="1632175038">
     <w:abstractNumId w:val="2"/>
   </w:num>
-  <w:num w:numId="9" w16cid:durableId="230359577">
-    <w:abstractNumId w:val="20"/>
+  <w:num w:numId="7" w16cid:durableId="1799105403">
+    <w:abstractNumId w:val="23"/>
   </w:num>
-  <w:num w:numId="10" w16cid:durableId="988896879">
-    <w:abstractNumId w:val="5"/>
+  <w:num w:numId="8" w16cid:durableId="1857379432">
+    <w:abstractNumId w:val="12"/>
+  </w:num>
+  <w:num w:numId="9" w16cid:durableId="1944073819">
+    <w:abstractNumId w:val="24"/>
+  </w:num>
+  <w:num w:numId="10" w16cid:durableId="1945261314">
+    <w:abstractNumId w:val="9"/>
   </w:num>
   <w:num w:numId="11" w16cid:durableId="1975987258">
     <w:abstractNumId w:val="6"/>
   </w:num>
-  <w:num w:numId="12" w16cid:durableId="629628586">
+  <w:num w:numId="12" w16cid:durableId="1983386787">
+    <w:abstractNumId w:val="13"/>
+  </w:num>
+  <w:num w:numId="13" w16cid:durableId="2063550637">
+    <w:abstractNumId w:val="17"/>
+  </w:num>
+  <w:num w:numId="14" w16cid:durableId="2114393891">
+    <w:abstractNumId w:val="18"/>
+  </w:num>
+  <w:num w:numId="15" w16cid:durableId="2114670366">
+    <w:abstractNumId w:val="7"/>
+  </w:num>
+  <w:num w:numId="16" w16cid:durableId="230359577">
+    <w:abstractNumId w:val="20"/>
+  </w:num>
+  <w:num w:numId="17" w16cid:durableId="248127359">
+    <w:abstractNumId w:val="14"/>
+  </w:num>
+  <w:num w:numId="18" w16cid:durableId="303580823">
+    <w:abstractNumId w:val="19"/>
+  </w:num>
+  <w:num w:numId="19" w16cid:durableId="471680790">
+    <w:abstractNumId w:val="22"/>
+  </w:num>
+  <w:num w:numId="20" w16cid:durableId="570384180">
+    <w:abstractNumId w:val="15"/>
+  </w:num>
+  <w:num w:numId="21" w16cid:durableId="595216287">
+    <w:abstractNumId w:val="26"/>
+  </w:num>
+  <w:num w:numId="22" w16cid:durableId="629628586">
     <w:abstractNumId w:val="8"/>
   </w:num>
-  <w:num w:numId="13" w16cid:durableId="66265078">
+  <w:num w:numId="23" w16cid:durableId="66265078">
     <w:abstractNumId w:val="4"/>
   </w:num>
-  <w:num w:numId="14" w16cid:durableId="885871959">
+  <w:num w:numId="24" w16cid:durableId="789204396">
+    <w:abstractNumId w:val="11"/>
+  </w:num>
+  <w:num w:numId="25" w16cid:durableId="885871959">
     <w:abstractNumId w:val="10"/>
   </w:num>
-  <w:num w:numId="15" w16cid:durableId="1799105403">
-    <w:abstractNumId w:val="23"/>
-  </w:num>
-  <w:num w:numId="16" w16cid:durableId="570384180">
-    <w:abstractNumId w:val="15"/>
-  </w:num>
-  <w:num w:numId="17" w16cid:durableId="994384007">
-    <w:abstractNumId w:val="1"/>
-  </w:num>
-  <w:num w:numId="18" w16cid:durableId="789204396">
-    <w:abstractNumId w:val="11"/>
-  </w:num>
-  <w:num w:numId="19" w16cid:durableId="934173533">
+  <w:num w:numId="26" w16cid:durableId="934173533">
     <w:abstractNumId w:val="0"/>
   </w:num>
-  <w:num w:numId="20" w16cid:durableId="248127359">
-    <w:abstractNumId w:val="14"/>
-  </w:num>
-  <w:num w:numId="21" w16cid:durableId="9600426">
+  <w:num w:numId="27" w16cid:durableId="9600426">
     <w:abstractNumId w:val="3"/>
   </w:num>
-  <w:num w:numId="22" w16cid:durableId="303580823">
-    <w:abstractNumId w:val="19"/>
+  <w:num w:numId="28" w16cid:durableId="988896879">
+    <w:abstractNumId w:val="5"/>
   </w:num>
-  <w:num w:numId="23" w16cid:durableId="471680790">
-    <w:abstractNumId w:val="22"/>
-  </w:num>
-  <w:num w:numId="24" w16cid:durableId="1857379432">
-    <w:abstractNumId w:val="12"/>
-  </w:num>
-  <w:num w:numId="25" w16cid:durableId="2063550637">
-    <w:abstractNumId w:val="17"/>
-  </w:num>
-  <w:num w:numId="26" w16cid:durableId="1217618102">
-    <w:abstractNumId w:val="16"/>
-  </w:num>
-  <w:num w:numId="27" w16cid:durableId="1983386787">
-    <w:abstractNumId w:val="13"/>
-  </w:num>
-  <w:num w:numId="28" w16cid:durableId="595216287">
-    <w:abstractNumId w:val="26"/>
-  </w:num>
-  <w:num w:numId="29" w16cid:durableId="1546798044">
-    <w:abstractNumId w:val="25"/>
+  <w:num w:numId="29" w16cid:durableId="994384007">
+    <w:abstractNumId w:val="1"/>
   </w:num>
   <w:numIdMacAtCleanup w:val="17"/>
 </w:numbering>
@@ -7963,7 +7961,7 @@
     <w:rsid w:val="007D4F88"/>
     <w:pPr>
       <w:numPr>
-        <w:numId w:val="1"/>
+        <w:numId w:val="9"/>
       </w:numPr>
     </w:pPr>
     <w:rPr>
@@ -8631,10 +8629,6 @@
 </file>
 
 <file path=customXml/item1.xml><?xml version="1.0" encoding="utf-8"?>
-<b:Sources xmlns:b="http://schemas.openxmlformats.org/officeDocument/2006/bibliography" xmlns="http://schemas.openxmlformats.org/officeDocument/2006/bibliography" SelectedStyle="/APASixthEditionOfficeOnline.xsl" StyleName="APA" Version="6"/>
-</file>
-
-<file path=customXml/item2.xml><?xml version="1.0" encoding="utf-8"?>
 <ct:contentTypeSchema xmlns:ct="http://schemas.microsoft.com/office/2006/metadata/contentType" xmlns:ma="http://schemas.microsoft.com/office/2006/metadata/properties/metaAttributes" ct:_="" ma:_="" ma:contentTypeName="Document" ma:contentTypeID="0x010100328EF57D97DE264AA14433C5440CB94B" ma:contentTypeVersion="0" ma:contentTypeDescription="Create a new document." ma:contentTypeScope="" ma:versionID="eb88c1afc906d6cb05bff76f6b6397d9">
   <xsd:schema xmlns:xsd="http://www.w3.org/2001/XMLSchema" xmlns:xs="http://www.w3.org/2001/XMLSchema" xmlns:p="http://schemas.microsoft.com/office/2006/metadata/properties" targetNamespace="http://schemas.microsoft.com/office/2006/metadata/properties" ma:root="true" ma:fieldsID="d581f8e8412fe39a3794ccf6300b7a27">
     <xsd:element name="properties">
@@ -8748,13 +8742,7 @@
 </ct:contentTypeSchema>
 </file>
 
-<file path=customXml/item3.xml><?xml version="1.0" encoding="utf-8"?>
-<p:properties xmlns:p="http://schemas.microsoft.com/office/2006/metadata/properties" xmlns:xsi="http://www.w3.org/2001/XMLSchema-instance" xmlns:pc="http://schemas.microsoft.com/office/infopath/2007/PartnerControls">
-  <documentManagement/>
-</p:properties>
-</file>
-
-<file path=customXml/item4.xml><?xml version="1.0" encoding="utf-8"?>
+<file path=customXml/item2.xml><?xml version="1.0" encoding="utf-8"?>
 <?mso-contentType ?>
 <FormTemplates xmlns="http://schemas.microsoft.com/sharepoint/v3/contenttype/forms">
   <Display>DocumentLibraryForm</Display>
@@ -8763,15 +8751,13 @@
 </FormTemplates>
 </file>
 
-<file path=customXml/itemProps1.xml><?xml version="1.0" encoding="utf-8"?>
-<ds:datastoreItem xmlns:ds="http://schemas.openxmlformats.org/officeDocument/2006/customXml" ds:itemID="{643C18FD-E13B-440B-A927-4598C5E7B7D6}">
-  <ds:schemaRefs>
-    <ds:schemaRef ds:uri="http://schemas.openxmlformats.org/officeDocument/2006/bibliography"/>
-  </ds:schemaRefs>
-</ds:datastoreItem>
+<file path=customXml/item3.xml><?xml version="1.0" encoding="utf-8"?>
+<p:properties xmlns:p="http://schemas.microsoft.com/office/2006/metadata/properties" xmlns:xsi="http://www.w3.org/2001/XMLSchema-instance" xmlns:pc="http://schemas.microsoft.com/office/infopath/2007/PartnerControls">
+  <documentManagement/>
+</p:properties>
 </file>
 
-<file path=customXml/itemProps2.xml><?xml version="1.0" encoding="utf-8"?>
+<file path=customXml/itemProps1.xml><?xml version="1.0" encoding="utf-8"?>
 <ds:datastoreItem xmlns:ds="http://schemas.openxmlformats.org/officeDocument/2006/customXml" ds:itemID="{06AF1F90-0D74-4351-9FD0-3BE843286E7C}">
   <ds:schemaRefs>
     <ds:schemaRef ds:uri="http://schemas.microsoft.com/office/2006/metadata/contentType"/>
@@ -8787,6 +8773,14 @@
 </ds:datastoreItem>
 </file>
 
+<file path=customXml/itemProps2.xml><?xml version="1.0" encoding="utf-8"?>
+<ds:datastoreItem xmlns:ds="http://schemas.openxmlformats.org/officeDocument/2006/customXml" ds:itemID="{E256B7EA-B552-4ACF-B03A-131459BD0D1A}">
+  <ds:schemaRefs>
+    <ds:schemaRef ds:uri="http://schemas.microsoft.com/sharepoint/v3/contenttype/forms"/>
+  </ds:schemaRefs>
+</ds:datastoreItem>
+</file>
+
 <file path=customXml/itemProps3.xml><?xml version="1.0" encoding="utf-8"?>
 <ds:datastoreItem xmlns:ds="http://schemas.openxmlformats.org/officeDocument/2006/customXml" ds:itemID="{290C4DBB-DEBE-49E9-8562-535A399C40A5}">
   <ds:schemaRefs>
@@ -8794,12 +8788,4 @@
     <ds:schemaRef ds:uri="http://schemas.microsoft.com/office/infopath/2007/PartnerControls"/>
   </ds:schemaRefs>
 </ds:datastoreItem>
-</file>
-
-<file path=customXml/itemProps4.xml><?xml version="1.0" encoding="utf-8"?>
-<ds:datastoreItem xmlns:ds="http://schemas.openxmlformats.org/officeDocument/2006/customXml" ds:itemID="{E256B7EA-B552-4ACF-B03A-131459BD0D1A}">
-  <ds:schemaRefs>
-    <ds:schemaRef ds:uri="http://schemas.microsoft.com/sharepoint/v3/contenttype/forms"/>
-  </ds:schemaRefs>
-</ds:datastoreItem>
 </file>
</xml_diff>